<commit_message>
feat: add tested NOC and affidavit form-to-DOCX generation
</commit_message>
<xml_diff>
--- a/templates/Affidavit_Template.docx
+++ b/templates/Affidavit_Template.docx
@@ -5,7 +5,7 @@
     <w:p>
       <w:pPr>
         <w:spacing w:after="0" w:line="240" w:lineRule="auto"/>
-        <w:ind w:left="-1276" w:firstLine="1276"/>
+        <w:ind w:left="-1276" w:right="90" w:firstLine="1276"/>
         <w:jc w:val="center"/>
         <w:rPr>
           <w:rFonts w:ascii="Nirmala UI" w:cs="Nirmala UI" w:eastAsia="Nirmala UI" w:hAnsi="Nirmala UI"/>
@@ -14,7 +14,7 @@
           <w:u w:val="single"/>
         </w:rPr>
       </w:pPr>
-      <w:bookmarkStart w:colFirst="0" w:colLast="0" w:name="_heading=h.jlvb1ef4zl53" w:id="0"/>
+      <w:bookmarkStart w:colFirst="0" w:colLast="0" w:name="_heading=h.j8djp2c0njuj" w:id="0"/>
       <w:bookmarkEnd w:id="0"/>
       <w:r>
         <w:rPr>
@@ -25,7 +25,7 @@
     <w:p>
       <w:pPr>
         <w:spacing w:after="0" w:line="240" w:lineRule="auto"/>
-        <w:ind w:left="-1276" w:firstLine="1276"/>
+        <w:ind w:left="-1276" w:right="90" w:firstLine="1276"/>
         <w:jc w:val="center"/>
         <w:rPr>
           <w:rFonts w:ascii="Nirmala UI" w:cs="Nirmala UI" w:eastAsia="Nirmala UI" w:hAnsi="Nirmala UI"/>
@@ -34,7 +34,7 @@
           <w:u w:val="single"/>
         </w:rPr>
       </w:pPr>
-      <w:bookmarkStart w:colFirst="0" w:colLast="0" w:name="_heading=h.4sk80lvr5i9t" w:id="1"/>
+      <w:bookmarkStart w:colFirst="0" w:colLast="0" w:name="_heading=h.qf70ipbbo200" w:id="1"/>
       <w:bookmarkEnd w:id="1"/>
       <w:r>
         <w:rPr>
@@ -45,7 +45,7 @@
     <w:p>
       <w:pPr>
         <w:spacing w:after="0" w:line="240" w:lineRule="auto"/>
-        <w:ind w:left="-1276" w:firstLine="1276"/>
+        <w:ind w:left="-1276" w:right="90" w:firstLine="1276"/>
         <w:jc w:val="center"/>
         <w:rPr>
           <w:rFonts w:ascii="Nirmala UI" w:cs="Nirmala UI" w:eastAsia="Nirmala UI" w:hAnsi="Nirmala UI"/>
@@ -64,13 +64,15 @@
     </w:p>
     <w:p>
       <w:pPr>
-        <w:spacing w:after="0" w:line="240" w:lineRule="auto"/>
-        <w:ind w:left="-1276" w:firstLine="1276"/>
+        <w:spacing w:after="160" w:line="240" w:lineRule="auto"/>
+        <w:ind w:left="-1276" w:right="90" w:firstLine="1276"/>
         <w:jc w:val="center"/>
         <w:rPr>
           <w:rFonts w:ascii="Nirmala UI" w:cs="Nirmala UI" w:eastAsia="Nirmala UI" w:hAnsi="Nirmala UI"/>
           <w:b w:val="1"/>
           <w:bCs w:val="1"/>
+          <w:sz w:val="36"/>
+          <w:szCs w:val="36"/>
           <w:u w:val="single"/>
         </w:rPr>
       </w:pPr>
@@ -81,6 +83,8 @@
           <w:rFonts w:ascii="Nirmala UI" w:cs="Nirmala UI" w:eastAsia="Nirmala UI" w:hAnsi="Nirmala UI"/>
           <w:b w:val="1"/>
           <w:bCs w:val="1"/>
+          <w:sz w:val="36"/>
+          <w:szCs w:val="36"/>
           <w:u w:val="single"/>
           <w:rtl w:val="0"/>
         </w:rPr>
@@ -90,7 +94,7 @@
     <w:p>
       <w:pPr>
         <w:spacing w:after="0" w:line="240" w:lineRule="auto"/>
-        <w:ind w:left="-1276" w:firstLine="1276"/>
+        <w:ind w:left="-1276" w:right="90" w:firstLine="1276"/>
         <w:jc w:val="center"/>
         <w:rPr>
           <w:rFonts w:ascii="Nirmala UI" w:cs="Nirmala UI" w:eastAsia="Nirmala UI" w:hAnsi="Nirmala UI"/>
@@ -110,17 +114,23 @@
     <w:p>
       <w:pPr>
         <w:spacing w:after="0" w:line="240" w:lineRule="auto"/>
-        <w:ind w:left="-1276" w:right="0" w:firstLine="1276"/>
-        <w:jc w:val="center"/>
-        <w:rPr>
-          <w:rFonts w:ascii="Nirmala UI" w:cs="Nirmala UI" w:eastAsia="Nirmala UI" w:hAnsi="Nirmala UI"/>
-          <w:b w:val="1"/>
-          <w:bCs w:val="1"/>
-          <w:u w:val="single"/>
-        </w:rPr>
-      </w:pPr>
-      <w:bookmarkStart w:colFirst="0" w:colLast="0" w:name="_heading=h.v587brf3ta1w" w:id="5"/>
-      <w:bookmarkEnd w:id="5"/>
+        <w:ind w:right="90"/>
+        <w:jc w:val="both"/>
+        <w:rPr>
+          <w:rFonts w:ascii="Kruti Dev 010" w:cs="Kruti Dev 010" w:eastAsia="Kruti Dev 010" w:hAnsi="Kruti Dev 010"/>
+          <w:b w:val="1"/>
+          <w:bCs w:val="1"/>
+        </w:rPr>
+      </w:pPr>
+      <w:r>
+        <w:rPr>
+          <w:rFonts w:ascii="Nirmala UI" w:cs="Nirmala UI" w:eastAsia="Nirmala UI" w:hAnsi="Nirmala UI"/>
+          <w:sz w:val="26"/>
+          <w:szCs w:val="26"/>
+          <w:rtl w:val="0"/>
+        </w:rPr>
+        <w:t xml:space="preserve">           मैं शपथपूर्वक कथन करता/ करती हूँ कि:-</w:t>
+      </w:r>
       <w:r>
         <w:rPr>
           <w:rtl w:val="0"/>
@@ -130,12 +140,12 @@
     <w:p>
       <w:pPr>
         <w:spacing w:after="0" w:line="240" w:lineRule="auto"/>
+        <w:ind w:right="90"/>
         <w:jc w:val="both"/>
         <w:rPr>
           <w:rFonts w:ascii="Kruti Dev 010" w:cs="Kruti Dev 010" w:eastAsia="Kruti Dev 010" w:hAnsi="Kruti Dev 010"/>
           <w:b w:val="1"/>
           <w:bCs w:val="1"/>
-          <w:u w:val="single"/>
         </w:rPr>
       </w:pPr>
       <w:r>
@@ -147,6 +157,7 @@
     <w:p>
       <w:pPr>
         <w:spacing w:after="0" w:line="240" w:lineRule="auto"/>
+        <w:ind w:right="90"/>
         <w:jc w:val="both"/>
         <w:rPr>
           <w:rFonts w:ascii="Kruti Dev 010" w:cs="Kruti Dev 010" w:eastAsia="Kruti Dev 010" w:hAnsi="Kruti Dev 010"/>
@@ -157,9 +168,15 @@
       <w:r>
         <w:rPr>
           <w:rFonts w:ascii="Nirmala UI" w:cs="Nirmala UI" w:eastAsia="Nirmala UI" w:hAnsi="Nirmala UI"/>
-          <w:rtl w:val="0"/>
-        </w:rPr>
-        <w:t xml:space="preserve">           मैं शपथपूर्वक कथन करता/ करती हूँ कि:-</w:t>
+          <w:sz w:val="26"/>
+          <w:szCs w:val="26"/>
+          <w:rtl w:val="0"/>
+        </w:rPr>
+        <w:t xml:space="preserve">            मेरा नाम</w:t>
+        <w:tab/>
+        <w:tab/>
+        <w:tab/>
+        <w:t xml:space="preserve">: {{NAME}}</w:t>
       </w:r>
       <w:r>
         <w:rPr>
@@ -170,6 +187,7 @@
     <w:p>
       <w:pPr>
         <w:spacing w:after="0" w:line="240" w:lineRule="auto"/>
+        <w:ind w:left="360" w:right="90" w:firstLine="360"/>
         <w:jc w:val="both"/>
         <w:rPr>
           <w:rFonts w:ascii="Kruti Dev 010" w:cs="Kruti Dev 010" w:eastAsia="Kruti Dev 010" w:hAnsi="Kruti Dev 010"/>
@@ -179,6 +197,19 @@
       </w:pPr>
       <w:r>
         <w:rPr>
+          <w:rFonts w:ascii="Nirmala UI" w:cs="Nirmala UI" w:eastAsia="Nirmala UI" w:hAnsi="Nirmala UI"/>
+          <w:sz w:val="26"/>
+          <w:szCs w:val="26"/>
+          <w:rtl w:val="0"/>
+        </w:rPr>
+        <w:t xml:space="preserve">  पिता का नाम</w:t>
+        <w:tab/>
+        <w:tab/>
+        <w:tab/>
+        <w:t xml:space="preserve">: {{FATHER}}</w:t>
+      </w:r>
+      <w:r>
+        <w:rPr>
           <w:rtl w:val="0"/>
         </w:rPr>
       </w:r>
@@ -186,6 +217,7 @@
     <w:p>
       <w:pPr>
         <w:spacing w:after="0" w:line="240" w:lineRule="auto"/>
+        <w:ind w:left="360" w:right="90" w:firstLine="360"/>
         <w:jc w:val="both"/>
         <w:rPr>
           <w:rFonts w:ascii="Kruti Dev 010" w:cs="Kruti Dev 010" w:eastAsia="Kruti Dev 010" w:hAnsi="Kruti Dev 010"/>
@@ -196,24 +228,27 @@
       <w:r>
         <w:rPr>
           <w:rFonts w:ascii="Nirmala UI" w:cs="Nirmala UI" w:eastAsia="Nirmala UI" w:hAnsi="Nirmala UI"/>
-          <w:rtl w:val="0"/>
-        </w:rPr>
-        <w:t xml:space="preserve">            मेरा नाम</w:t>
-        <w:tab/>
-        <w:tab/>
-        <w:tab/>
-        <w:t xml:space="preserve">: श्री {{NAME}}</w:t>
-      </w:r>
-      <w:r>
-        <w:rPr>
-          <w:rtl w:val="0"/>
-        </w:rPr>
-      </w:r>
-    </w:p>
-    <w:p>
-      <w:pPr>
-        <w:spacing w:after="0" w:line="240" w:lineRule="auto"/>
-        <w:ind w:left="360" w:firstLine="360"/>
+          <w:sz w:val="26"/>
+          <w:szCs w:val="26"/>
+          <w:rtl w:val="0"/>
+        </w:rPr>
+        <w:t xml:space="preserve">  उम्र</w:t>
+        <w:tab/>
+        <w:tab/>
+        <w:tab/>
+        <w:tab/>
+        <w:t xml:space="preserve">: {{AGE}} वर्ष</w:t>
+      </w:r>
+      <w:r>
+        <w:rPr>
+          <w:rtl w:val="0"/>
+        </w:rPr>
+      </w:r>
+    </w:p>
+    <w:p>
+      <w:pPr>
+        <w:spacing w:after="0" w:line="276" w:lineRule="auto"/>
+        <w:ind w:left="709" w:right="90" w:firstLine="10.999999999999943"/>
         <w:jc w:val="both"/>
         <w:rPr>
           <w:rFonts w:ascii="Kruti Dev 010" w:cs="Kruti Dev 010" w:eastAsia="Kruti Dev 010" w:hAnsi="Kruti Dev 010"/>
@@ -224,67 +259,13 @@
       <w:r>
         <w:rPr>
           <w:rFonts w:ascii="Nirmala UI" w:cs="Nirmala UI" w:eastAsia="Nirmala UI" w:hAnsi="Nirmala UI"/>
-          <w:rtl w:val="0"/>
-        </w:rPr>
-        <w:t xml:space="preserve">  पिता का नाम</w:t>
-        <w:tab/>
-        <w:tab/>
-        <w:tab/>
-        <w:t xml:space="preserve">: श्री {{FATHER}}</w:t>
-      </w:r>
-      <w:r>
-        <w:rPr>
-          <w:rtl w:val="0"/>
-        </w:rPr>
-      </w:r>
-    </w:p>
-    <w:p>
-      <w:pPr>
-        <w:spacing w:after="0" w:line="240" w:lineRule="auto"/>
-        <w:ind w:left="360" w:firstLine="360"/>
-        <w:jc w:val="both"/>
-        <w:rPr>
-          <w:rFonts w:ascii="Kruti Dev 010" w:cs="Kruti Dev 010" w:eastAsia="Kruti Dev 010" w:hAnsi="Kruti Dev 010"/>
-          <w:b w:val="1"/>
-          <w:bCs w:val="1"/>
-        </w:rPr>
-      </w:pPr>
-      <w:r>
-        <w:rPr>
-          <w:rFonts w:ascii="Nirmala UI" w:cs="Nirmala UI" w:eastAsia="Nirmala UI" w:hAnsi="Nirmala UI"/>
-          <w:rtl w:val="0"/>
-        </w:rPr>
-        <w:t xml:space="preserve">  उम्र</w:t>
-        <w:tab/>
-        <w:tab/>
-        <w:tab/>
-        <w:tab/>
-        <w:t xml:space="preserve">: </w:t>
-      </w:r>
-      <w:r>
-        <w:rPr>
-          <w:rFonts w:ascii="Nirmala UI" w:cs="Nirmala UI" w:eastAsia="Nirmala UI" w:hAnsi="Nirmala UI"/>
-          <w:b w:val="1"/>
-          <w:bCs w:val="1"/>
-          <w:rtl w:val="0"/>
-        </w:rPr>
-        <w:t xml:space="preserve"> </w:t>
-      </w:r>
-      <w:r>
-        <w:rPr>
-          <w:rFonts w:ascii="Kruti Dev 010" w:cs="Kruti Dev 010" w:eastAsia="Kruti Dev 010" w:hAnsi="Kruti Dev 010"/>
-          <w:sz w:val="32"/>
-          <w:szCs w:val="32"/>
-          <w:rtl w:val="0"/>
-        </w:rPr>
-        <w:t xml:space="preserve">{{AGE}}</w:t>
-      </w:r>
-      <w:r>
-        <w:rPr>
-          <w:rFonts w:ascii="Nirmala UI" w:cs="Nirmala UI" w:eastAsia="Nirmala UI" w:hAnsi="Nirmala UI"/>
-          <w:rtl w:val="0"/>
-        </w:rPr>
-        <w:t xml:space="preserve"> वर्ष</w:t>
+          <w:sz w:val="26"/>
+          <w:szCs w:val="26"/>
+          <w:rtl w:val="0"/>
+        </w:rPr>
+        <w:t xml:space="preserve">  निवास                             </w:t>
+        <w:tab/>
+        <w:t xml:space="preserve">: {{ADDRESS}}</w:t>
       </w:r>
       <w:r>
         <w:rPr>
@@ -295,44 +276,7 @@
     <w:p>
       <w:pPr>
         <w:spacing w:after="0" w:line="276" w:lineRule="auto"/>
-        <w:ind w:left="709" w:firstLine="10.999999999999943"/>
-        <w:jc w:val="both"/>
-        <w:rPr>
-          <w:rFonts w:ascii="Kruti Dev 010" w:cs="Kruti Dev 010" w:eastAsia="Kruti Dev 010" w:hAnsi="Kruti Dev 010"/>
-          <w:b w:val="1"/>
-          <w:bCs w:val="1"/>
-        </w:rPr>
-      </w:pPr>
-      <w:r>
-        <w:rPr>
-          <w:rFonts w:ascii="Nirmala UI" w:cs="Nirmala UI" w:eastAsia="Nirmala UI" w:hAnsi="Nirmala UI"/>
-          <w:rtl w:val="0"/>
-        </w:rPr>
-        <w:t xml:space="preserve">  निवास                                 :</w:t>
-      </w:r>
-      <w:r>
-        <w:rPr>
-          <w:rtl w:val="0"/>
-        </w:rPr>
-        <w:t xml:space="preserve"> </w:t>
-      </w:r>
-      <w:r>
-        <w:rPr>
-          <w:rFonts w:ascii="Nirmala UI" w:cs="Nirmala UI" w:eastAsia="Nirmala UI" w:hAnsi="Nirmala UI"/>
-          <w:rtl w:val="0"/>
-        </w:rPr>
-        <w:t xml:space="preserve">{{ADDRESS}}</w:t>
-      </w:r>
-      <w:r>
-        <w:rPr>
-          <w:rtl w:val="0"/>
-        </w:rPr>
-      </w:r>
-    </w:p>
-    <w:p>
-      <w:pPr>
-        <w:spacing w:after="0" w:line="276" w:lineRule="auto"/>
-        <w:ind w:left="709" w:firstLine="10.999999999999943"/>
+        <w:ind w:left="709" w:right="90" w:firstLine="10.999999999999943"/>
         <w:jc w:val="both"/>
         <w:rPr>
           <w:rFonts w:ascii="Kruti Dev 010" w:cs="Kruti Dev 010" w:eastAsia="Kruti Dev 010" w:hAnsi="Kruti Dev 010"/>
@@ -351,13 +295,15 @@
           <w:numId w:val="1"/>
         </w:numPr>
         <w:spacing w:after="0" w:line="276" w:lineRule="auto"/>
-        <w:ind w:left="1080" w:hanging="360"/>
+        <w:ind w:left="1080" w:right="90" w:hanging="360"/>
         <w:jc w:val="both"/>
         <w:rPr/>
       </w:pPr>
       <w:r>
         <w:rPr>
           <w:rFonts w:ascii="Nirmala UI" w:cs="Nirmala UI" w:eastAsia="Nirmala UI" w:hAnsi="Nirmala UI"/>
+          <w:sz w:val="26"/>
+          <w:szCs w:val="26"/>
           <w:rtl w:val="0"/>
         </w:rPr>
         <w:t xml:space="preserve">यह कि, हमारे द्वारा परियोजना “</w:t>
@@ -368,6 +314,8 @@
           <w:b w:val="1"/>
           <w:bCs w:val="1"/>
           <w:color w:val="000000"/>
+          <w:sz w:val="26"/>
+          <w:szCs w:val="26"/>
           <w:rtl w:val="0"/>
         </w:rPr>
         <w:t xml:space="preserve">{{PROJECT}}</w:t>
@@ -375,6 +323,8 @@
       <w:r>
         <w:rPr>
           <w:rFonts w:ascii="Nirmala UI" w:cs="Nirmala UI" w:eastAsia="Nirmala UI" w:hAnsi="Nirmala UI"/>
+          <w:sz w:val="26"/>
+          <w:szCs w:val="26"/>
           <w:rtl w:val="0"/>
         </w:rPr>
         <w:t xml:space="preserve"> जो की खसरा नंबर </w:t>
@@ -383,16 +333,19 @@
         <w:rPr>
           <w:rFonts w:ascii="Nirmala UI" w:cs="Nirmala UI" w:eastAsia="Nirmala UI" w:hAnsi="Nirmala UI"/>
           <w:color w:val="000000"/>
+          <w:sz w:val="26"/>
+          <w:szCs w:val="26"/>
           <w:rtl w:val="0"/>
         </w:rPr>
         <w:t xml:space="preserve">खसरा नंबर </w:t>
       </w:r>
       <w:r>
         <w:rPr>
-          <w:b w:val="1"/>
-          <w:bCs w:val="1"/>
-          <w:sz w:val="28"/>
-          <w:szCs w:val="28"/>
+          <w:rFonts w:ascii="Nirmala UI" w:cs="Nirmala UI" w:eastAsia="Nirmala UI" w:hAnsi="Nirmala UI"/>
+          <w:b w:val="1"/>
+          <w:bCs w:val="1"/>
+          <w:sz w:val="26"/>
+          <w:szCs w:val="26"/>
           <w:rtl w:val="0"/>
         </w:rPr>
         <w:t xml:space="preserve">{{LAND}}</w:t>
@@ -400,12 +353,15 @@
       <w:r>
         <w:rPr>
           <w:rFonts w:ascii="Nirmala UI" w:cs="Nirmala UI" w:eastAsia="Nirmala UI" w:hAnsi="Nirmala UI"/>
+          <w:sz w:val="26"/>
+          <w:szCs w:val="26"/>
           <w:rtl w:val="0"/>
         </w:rPr>
         <w:t xml:space="preserve"> {{PROJECT_LOCATION}} विकसित की गई है, जिसका रेरा पंजीयन क्रमांक </w:t>
       </w:r>
       <w:r>
         <w:rPr>
+          <w:rFonts w:ascii="Nirmala UI" w:cs="Nirmala UI" w:eastAsia="Nirmala UI" w:hAnsi="Nirmala UI"/>
           <w:b w:val="1"/>
           <w:bCs w:val="1"/>
           <w:sz w:val="26"/>
@@ -417,6 +373,8 @@
       <w:r>
         <w:rPr>
           <w:rFonts w:ascii="Nirmala UI" w:cs="Nirmala UI" w:eastAsia="Nirmala UI" w:hAnsi="Nirmala UI"/>
+          <w:sz w:val="26"/>
+          <w:szCs w:val="26"/>
           <w:rtl w:val="0"/>
         </w:rPr>
         <w:t xml:space="preserve">यह की विकासकर्ता </w:t>
@@ -426,8 +384,8 @@
           <w:rFonts w:ascii="Nirmala UI" w:cs="Nirmala UI" w:eastAsia="Nirmala UI" w:hAnsi="Nirmala UI"/>
           <w:b w:val="1"/>
           <w:bCs w:val="1"/>
-          <w:sz w:val="25"/>
-          <w:szCs w:val="25"/>
+          <w:sz w:val="26"/>
+          <w:szCs w:val="26"/>
           <w:rtl w:val="0"/>
         </w:rPr>
         <w:t xml:space="preserve">{{DEVELOPER}}</w:t>
@@ -435,66 +393,28 @@
       <w:r>
         <w:rPr>
           <w:rFonts w:ascii="Nirmala UI" w:cs="Nirmala UI" w:eastAsia="Nirmala UI" w:hAnsi="Nirmala UI"/>
-          <w:sz w:val="25"/>
-          <w:szCs w:val="25"/>
-          <w:rtl w:val="0"/>
-        </w:rPr>
-        <w:t xml:space="preserve"> </w:t>
-      </w:r>
-      <w:r>
-        <w:rPr>
-          <w:rFonts w:ascii="Nirmala UI" w:cs="Nirmala UI" w:eastAsia="Nirmala UI" w:hAnsi="Nirmala UI"/>
-          <w:rtl w:val="0"/>
-        </w:rPr>
-        <w:t xml:space="preserve">द्वारा परियोजना का विकास कार्य सक्षम प्राधिकारी से प्राप्त अनुमति के अनुसार पूर्ण कर दिया गया है एवं सक्षम प्राधिकारी से परियोजना का पूर्णतः प्रमाण पत्र प्राप्त कर लिया है जिसका पूर्णता प्रमाण पत्र क्रमांक </w:t>
-      </w:r>
-      <w:r>
-        <w:rPr>
-          <w:rFonts w:ascii="Bookman Old Style" w:cs="Bookman Old Style" w:eastAsia="Bookman Old Style" w:hAnsi="Bookman Old Style"/>
-          <w:b w:val="1"/>
-          <w:bCs w:val="1"/>
-          <w:sz w:val="28"/>
-          <w:szCs w:val="28"/>
-          <w:rtl w:val="0"/>
-        </w:rPr>
-        <w:t xml:space="preserve">{{CERT_NO}}</w:t>
-      </w:r>
-      <w:r>
-        <w:rPr>
-          <w:rFonts w:ascii="Nirmala UI" w:cs="Nirmala UI" w:eastAsia="Nirmala UI" w:hAnsi="Nirmala UI"/>
-          <w:b w:val="1"/>
-          <w:bCs w:val="1"/>
-          <w:sz w:val="26"/>
-          <w:szCs w:val="26"/>
-          <w:rtl w:val="0"/>
-        </w:rPr>
-        <w:t xml:space="preserve"> </w:t>
-      </w:r>
-      <w:r>
-        <w:rPr>
-          <w:rFonts w:ascii="Nirmala UI" w:cs="Nirmala UI" w:eastAsia="Nirmala UI" w:hAnsi="Nirmala UI"/>
-          <w:b w:val="1"/>
-          <w:bCs w:val="1"/>
-          <w:sz w:val="25"/>
-          <w:szCs w:val="25"/>
-          <w:rtl w:val="0"/>
-        </w:rPr>
-        <w:t xml:space="preserve">दिनांक </w:t>
-      </w:r>
-      <w:r>
-        <w:rPr>
-          <w:rFonts w:ascii="Bookman Old Style" w:cs="Bookman Old Style" w:eastAsia="Bookman Old Style" w:hAnsi="Bookman Old Style"/>
-          <w:b w:val="1"/>
-          <w:bCs w:val="1"/>
-          <w:sz w:val="28"/>
-          <w:szCs w:val="28"/>
-          <w:rtl w:val="0"/>
-        </w:rPr>
-        <w:t xml:space="preserve">{{CERT_DATE}}</w:t>
-      </w:r>
-      <w:r>
-        <w:rPr>
-          <w:rFonts w:ascii="Nirmala UI" w:cs="Nirmala UI" w:eastAsia="Nirmala UI" w:hAnsi="Nirmala UI"/>
+          <w:sz w:val="26"/>
+          <w:szCs w:val="26"/>
+          <w:rtl w:val="0"/>
+        </w:rPr>
+        <w:t xml:space="preserve"> द्वारा परियोजना का विकास कार्य सक्षम प्राधिकारी से प्राप्त अनुमति के अनुसार पूर्ण कर दिया गया है एवं सक्षम प्राधिकारी से परियोजना का पूर्णतः प्रमाण पत्र प्राप्त कर लिया है जिसका पूर्णता प्रमाण पत्र क्रमांक </w:t>
+      </w:r>
+      <w:r>
+        <w:rPr>
+          <w:rFonts w:ascii="Nirmala UI" w:cs="Nirmala UI" w:eastAsia="Nirmala UI" w:hAnsi="Nirmala UI"/>
+          <w:b w:val="1"/>
+          <w:bCs w:val="1"/>
+          <w:sz w:val="26"/>
+          <w:szCs w:val="26"/>
+          <w:rtl w:val="0"/>
+        </w:rPr>
+        <w:t xml:space="preserve">{{CERT_NO}} दिनांक {{CERT_DATE}}</w:t>
+      </w:r>
+      <w:r>
+        <w:rPr>
+          <w:rFonts w:ascii="Nirmala UI" w:cs="Nirmala UI" w:eastAsia="Nirmala UI" w:hAnsi="Nirmala UI"/>
+          <w:sz w:val="26"/>
+          <w:szCs w:val="26"/>
           <w:rtl w:val="0"/>
         </w:rPr>
         <w:t xml:space="preserve"> है उसकी एक प्रति हमको प्रदान कर दी है एवं हम परियोजना के विकास कार्य से पूर्ण संतुष्ट हैं जिस तरह का विकास कार्य का वायदा हमसे किया गया था वैसा ही परियोजना का विकास कार्य किए जाने के कारण अब हम रहवासी गण इस परियोजना के उचित रखरखाव के लिए एक रहवासी संघ का गठन कर रहे हैं इस परियोजना में, मेरे द्वारा </w:t>
@@ -504,31 +424,17 @@
           <w:rFonts w:ascii="Nirmala UI" w:cs="Nirmala UI" w:eastAsia="Nirmala UI" w:hAnsi="Nirmala UI"/>
           <w:b w:val="1"/>
           <w:bCs w:val="1"/>
-          <w:rtl w:val="0"/>
-        </w:rPr>
-        <w:t xml:space="preserve">भूखंड क्रमांक</w:t>
-      </w:r>
-      <w:r>
-        <w:rPr>
-          <w:rFonts w:ascii="Kruti Dev 010" w:cs="Kruti Dev 010" w:eastAsia="Kruti Dev 010" w:hAnsi="Kruti Dev 010"/>
-          <w:b w:val="1"/>
-          <w:bCs w:val="1"/>
-          <w:rtl w:val="0"/>
-        </w:rPr>
-        <w:t xml:space="preserve"> </w:t>
-      </w:r>
-      <w:r>
-        <w:rPr>
-          <w:rFonts w:ascii="Nirmala UI" w:cs="Nirmala UI" w:eastAsia="Nirmala UI" w:hAnsi="Nirmala UI"/>
-          <w:b w:val="1"/>
-          <w:bCs w:val="1"/>
-          <w:rtl w:val="0"/>
-        </w:rPr>
-        <w:t xml:space="preserve">{{PLOT_NO}}</w:t>
-      </w:r>
-      <w:r>
-        <w:rPr>
-          <w:rFonts w:ascii="Nirmala UI" w:cs="Nirmala UI" w:eastAsia="Nirmala UI" w:hAnsi="Nirmala UI"/>
+          <w:sz w:val="26"/>
+          <w:szCs w:val="26"/>
+          <w:rtl w:val="0"/>
+        </w:rPr>
+        <w:t xml:space="preserve">भूखंड क्रमांक {{PLOT_NO}}</w:t>
+      </w:r>
+      <w:r>
+        <w:rPr>
+          <w:rFonts w:ascii="Nirmala UI" w:cs="Nirmala UI" w:eastAsia="Nirmala UI" w:hAnsi="Nirmala UI"/>
+          <w:sz w:val="26"/>
+          <w:szCs w:val="26"/>
           <w:rtl w:val="0"/>
         </w:rPr>
         <w:t xml:space="preserve"> क्रय किया गया है |</w:t>
@@ -542,7 +448,7 @@
     <w:p>
       <w:pPr>
         <w:spacing w:after="0" w:line="276" w:lineRule="auto"/>
-        <w:ind w:left="1080" w:firstLine="0"/>
+        <w:ind w:left="1080" w:right="90" w:firstLine="0"/>
         <w:jc w:val="both"/>
         <w:rPr>
           <w:rFonts w:ascii="Nirmala UI" w:cs="Nirmala UI" w:eastAsia="Nirmala UI" w:hAnsi="Nirmala UI"/>
@@ -561,30 +467,18 @@
           <w:numId w:val="1"/>
         </w:numPr>
         <w:spacing w:after="0" w:line="276" w:lineRule="auto"/>
-        <w:ind w:left="1080" w:hanging="360"/>
+        <w:ind w:left="1080" w:right="90" w:hanging="360"/>
         <w:jc w:val="both"/>
         <w:rPr/>
       </w:pPr>
       <w:r>
         <w:rPr>
           <w:rFonts w:ascii="Nirmala UI" w:cs="Nirmala UI" w:eastAsia="Nirmala UI" w:hAnsi="Nirmala UI"/>
-          <w:rtl w:val="0"/>
-        </w:rPr>
-        <w:t xml:space="preserve">यह कि</w:t>
-      </w:r>
-      <w:r>
-        <w:rPr>
-          <w:rFonts w:ascii="Kruti Dev 010" w:cs="Kruti Dev 010" w:eastAsia="Kruti Dev 010" w:hAnsi="Kruti Dev 010"/>
-          <w:rtl w:val="0"/>
-        </w:rPr>
-        <w:t xml:space="preserve"> </w:t>
-      </w:r>
-      <w:r>
-        <w:rPr>
-          <w:rFonts w:ascii="Nirmala UI" w:cs="Nirmala UI" w:eastAsia="Nirmala UI" w:hAnsi="Nirmala UI"/>
-          <w:rtl w:val="0"/>
-        </w:rPr>
-        <w:t xml:space="preserve">उक्त “</w:t>
+          <w:sz w:val="26"/>
+          <w:szCs w:val="26"/>
+          <w:rtl w:val="0"/>
+        </w:rPr>
+        <w:t xml:space="preserve">यह कि उक्त “</w:t>
       </w:r>
       <w:r>
         <w:rPr>
@@ -592,6 +486,8 @@
           <w:b w:val="1"/>
           <w:bCs w:val="1"/>
           <w:color w:val="000000"/>
+          <w:sz w:val="26"/>
+          <w:szCs w:val="26"/>
           <w:rtl w:val="0"/>
         </w:rPr>
         <w:t xml:space="preserve">{{ASSOCIATION}}</w:t>
@@ -599,23 +495,11 @@
       <w:r>
         <w:rPr>
           <w:rFonts w:ascii="Nirmala UI" w:cs="Nirmala UI" w:eastAsia="Nirmala UI" w:hAnsi="Nirmala UI"/>
-          <w:rtl w:val="0"/>
-        </w:rPr>
-        <w:t xml:space="preserve">” परियोजना / परिसर के रख रखाव के लिए</w:t>
-      </w:r>
-      <w:r>
-        <w:rPr>
-          <w:rFonts w:ascii="Kruti Dev 010" w:cs="Kruti Dev 010" w:eastAsia="Kruti Dev 010" w:hAnsi="Kruti Dev 010"/>
-          <w:rtl w:val="0"/>
-        </w:rPr>
-        <w:t xml:space="preserve"> </w:t>
-      </w:r>
-      <w:r>
-        <w:rPr>
-          <w:rFonts w:ascii="Nirmala UI" w:cs="Nirmala UI" w:eastAsia="Nirmala UI" w:hAnsi="Nirmala UI"/>
-          <w:rtl w:val="0"/>
-        </w:rPr>
-        <w:t xml:space="preserve">“</w:t>
+          <w:sz w:val="26"/>
+          <w:szCs w:val="26"/>
+          <w:rtl w:val="0"/>
+        </w:rPr>
+        <w:t xml:space="preserve">” परियोजना / परिसर के रख रखाव के लिए “</w:t>
       </w:r>
       <w:r>
         <w:rPr>
@@ -623,6 +507,8 @@
           <w:b w:val="1"/>
           <w:bCs w:val="1"/>
           <w:color w:val="000000"/>
+          <w:sz w:val="26"/>
+          <w:szCs w:val="26"/>
           <w:rtl w:val="0"/>
         </w:rPr>
         <w:t xml:space="preserve">{{ASSOCIATION}}</w:t>
@@ -630,6 +516,8 @@
       <w:r>
         <w:rPr>
           <w:rFonts w:ascii="Nirmala UI" w:cs="Nirmala UI" w:eastAsia="Nirmala UI" w:hAnsi="Nirmala UI"/>
+          <w:sz w:val="26"/>
+          <w:szCs w:val="26"/>
           <w:rtl w:val="0"/>
         </w:rPr>
         <w:t xml:space="preserve">” नामक रख रखाव समिति का गठन किया जा रहा है एवं उक्त “</w:t>
@@ -640,6 +528,8 @@
           <w:b w:val="1"/>
           <w:bCs w:val="1"/>
           <w:color w:val="000000"/>
+          <w:sz w:val="26"/>
+          <w:szCs w:val="26"/>
           <w:rtl w:val="0"/>
         </w:rPr>
         <w:t xml:space="preserve">{{PROJECT}}</w:t>
@@ -647,6 +537,8 @@
       <w:r>
         <w:rPr>
           <w:rFonts w:ascii="Nirmala UI" w:cs="Nirmala UI" w:eastAsia="Nirmala UI" w:hAnsi="Nirmala UI"/>
+          <w:sz w:val="26"/>
+          <w:szCs w:val="26"/>
           <w:rtl w:val="0"/>
         </w:rPr>
         <w:t xml:space="preserve">”  परियोजना / परिसर के सदस्यों द्वारा मुझे “</w:t>
@@ -657,6 +549,8 @@
           <w:b w:val="1"/>
           <w:bCs w:val="1"/>
           <w:color w:val="000000"/>
+          <w:sz w:val="26"/>
+          <w:szCs w:val="26"/>
           <w:rtl w:val="0"/>
         </w:rPr>
         <w:t xml:space="preserve">{{ASSOCIATION}}</w:t>
@@ -664,23 +558,11 @@
       <w:r>
         <w:rPr>
           <w:rFonts w:ascii="Nirmala UI" w:cs="Nirmala UI" w:eastAsia="Nirmala UI" w:hAnsi="Nirmala UI"/>
-          <w:rtl w:val="0"/>
-        </w:rPr>
-        <w:t xml:space="preserve">” का “</w:t>
-      </w:r>
-      <w:r>
-        <w:rPr>
-          <w:rFonts w:ascii="Mangal" w:cs="Mangal" w:eastAsia="Mangal" w:hAnsi="Mangal"/>
-          <w:rtl w:val="0"/>
-        </w:rPr>
-        <w:t xml:space="preserve">{{DESIGNATION}}</w:t>
-      </w:r>
-      <w:r>
-        <w:rPr>
-          <w:rFonts w:ascii="Nirmala UI" w:cs="Nirmala UI" w:eastAsia="Nirmala UI" w:hAnsi="Nirmala UI"/>
-          <w:rtl w:val="0"/>
-        </w:rPr>
-        <w:t xml:space="preserve">” मनोनीत किया है</w:t>
+          <w:sz w:val="26"/>
+          <w:szCs w:val="26"/>
+          <w:rtl w:val="0"/>
+        </w:rPr>
+        <w:t xml:space="preserve">” का “{{DESIGNATION}}” मनोनीत किया है |</w:t>
       </w:r>
       <w:r>
         <w:rPr>
@@ -703,7 +585,7 @@
         </w:pBdr>
         <w:shd w:fill="auto" w:val="clear"/>
         <w:spacing w:after="160" w:before="0" w:line="278.00000000000006" w:lineRule="auto"/>
-        <w:ind w:left="720" w:right="0" w:firstLine="0"/>
+        <w:ind w:left="720" w:right="90" w:firstLine="0"/>
         <w:jc w:val="both"/>
         <w:rPr>
           <w:rFonts w:ascii="Kruti Dev 010" w:cs="Kruti Dev 010" w:eastAsia="Kruti Dev 010" w:hAnsi="Kruti Dev 010"/>
@@ -737,69 +619,34 @@
           <w:tab w:val="left" w:leader="none" w:pos="720"/>
         </w:tabs>
         <w:spacing w:after="0" w:line="276" w:lineRule="auto"/>
-        <w:ind w:left="1080" w:hanging="360"/>
+        <w:ind w:left="1080" w:right="90" w:hanging="360"/>
         <w:jc w:val="both"/>
         <w:rPr/>
       </w:pPr>
       <w:r>
         <w:rPr>
           <w:rFonts w:ascii="Nirmala UI" w:cs="Nirmala UI" w:eastAsia="Nirmala UI" w:hAnsi="Nirmala UI"/>
-          <w:rtl w:val="0"/>
-        </w:rPr>
-        <w:t xml:space="preserve">यह कि मध्यप्रदेश भूखंड स्वमित्व अधिनियम 2000 की धारा 18 के अंतर्गत</w:t>
-      </w:r>
-      <w:r>
-        <w:rPr>
-          <w:rFonts w:ascii="Kruti Dev 010" w:cs="Kruti Dev 010" w:eastAsia="Kruti Dev 010" w:hAnsi="Kruti Dev 010"/>
-          <w:rtl w:val="0"/>
-        </w:rPr>
-        <w:t xml:space="preserve"> </w:t>
-      </w:r>
-      <w:r>
-        <w:rPr>
-          <w:rFonts w:ascii="Nirmala UI" w:cs="Nirmala UI" w:eastAsia="Nirmala UI" w:hAnsi="Nirmala UI"/>
-          <w:rtl w:val="0"/>
-        </w:rPr>
-        <w:t xml:space="preserve">श्रीमान सक्षम प्राधिकारी श्रीमान अनुविभागीय अधिकारी महोदय {{AUTHORITY_LOCATION}} के कार्यालय में पंजीयन हेतु आवेदन प्रस्तुत किया जा रहा है, जिसके समर्थन में मेरे द्वारा यह शपथ पत्र प्रस्तुत किया जा रहा है |</w:t>
-      </w:r>
-      <w:r>
-        <w:rPr>
-          <w:rtl w:val="0"/>
-        </w:rPr>
-      </w:r>
-    </w:p>
-    <w:p>
-      <w:pPr>
-        <w:keepNext w:val="0"/>
-        <w:keepLines w:val="0"/>
-        <w:pageBreakBefore w:val="0"/>
-        <w:widowControl w:val="1"/>
-        <w:pBdr>
-          <w:top w:space="0" w:sz="0" w:val="nil"/>
-          <w:left w:space="0" w:sz="0" w:val="nil"/>
-          <w:bottom w:space="0" w:sz="0" w:val="nil"/>
-          <w:right w:space="0" w:sz="0" w:val="nil"/>
-          <w:between w:space="0" w:sz="0" w:val="nil"/>
-        </w:pBdr>
-        <w:shd w:fill="auto" w:val="clear"/>
-        <w:spacing w:after="160" w:before="0" w:line="278.00000000000006" w:lineRule="auto"/>
-        <w:ind w:left="720" w:right="0" w:firstLine="0"/>
-        <w:jc w:val="both"/>
-        <w:rPr>
-          <w:rFonts w:ascii="Kruti Dev 010" w:cs="Kruti Dev 010" w:eastAsia="Kruti Dev 010" w:hAnsi="Kruti Dev 010"/>
-          <w:b w:val="0"/>
-          <w:bCs w:val="0"/>
-          <w:i w:val="0"/>
-          <w:iCs w:val="0"/>
-          <w:smallCaps w:val="0"/>
-          <w:strike w:val="0"/>
-          <w:color w:val="000000"/>
-          <w:sz w:val="24"/>
-          <w:szCs w:val="24"/>
-          <w:u w:val="none"/>
-          <w:shd w:fill="auto" w:val="clear"/>
-          <w:vertAlign w:val="baseline"/>
-        </w:rPr>
+          <w:sz w:val="26"/>
+          <w:szCs w:val="26"/>
+          <w:rtl w:val="0"/>
+        </w:rPr>
+        <w:t xml:space="preserve">यह कि मध्यप्रदेश भूखंड स्वमित्व अधिनियम 2000 की धारा 18 के अंतर्गत श्रीमान सक्षम प्राधिकारी श्रीमान अनुविभागीय अधिकारी महोदय {{AUTHORITY_LOCATION}} के कार्यालय में पंजीयन हेतु आवेदन प्रस्तुत किया जा रहा है, जिसके समर्थन में मेरे द्वारा यह शपथ पत्र प्रस्तुत किया जा रहा है |</w:t>
+      </w:r>
+      <w:r>
+        <w:rPr>
+          <w:rtl w:val="0"/>
+        </w:rPr>
+      </w:r>
+    </w:p>
+    <w:p>
+      <w:pPr>
+        <w:tabs>
+          <w:tab w:val="left" w:leader="none" w:pos="720"/>
+        </w:tabs>
+        <w:spacing w:after="0" w:line="276" w:lineRule="auto"/>
+        <w:ind w:left="1080" w:right="90" w:firstLine="0"/>
+        <w:jc w:val="both"/>
+        <w:rPr/>
       </w:pPr>
       <w:r>
         <w:rPr>
@@ -813,14 +660,19 @@
           <w:ilvl w:val="0"/>
           <w:numId w:val="1"/>
         </w:numPr>
+        <w:tabs>
+          <w:tab w:val="left" w:leader="none" w:pos="720"/>
+        </w:tabs>
         <w:spacing w:after="0" w:line="276" w:lineRule="auto"/>
-        <w:ind w:left="720" w:firstLine="0"/>
+        <w:ind w:left="1080" w:right="90" w:hanging="360"/>
         <w:jc w:val="both"/>
         <w:rPr/>
       </w:pPr>
       <w:r>
         <w:rPr>
           <w:rFonts w:ascii="Nirmala UI" w:cs="Nirmala UI" w:eastAsia="Nirmala UI" w:hAnsi="Nirmala UI"/>
+          <w:sz w:val="26"/>
+          <w:szCs w:val="26"/>
           <w:rtl w:val="0"/>
         </w:rPr>
         <w:t xml:space="preserve">यह कि में </w:t>
@@ -830,6 +682,8 @@
           <w:rFonts w:ascii="Nirmala UI" w:cs="Nirmala UI" w:eastAsia="Nirmala UI" w:hAnsi="Nirmala UI"/>
           <w:b w:val="1"/>
           <w:bCs w:val="1"/>
+          <w:sz w:val="26"/>
+          <w:szCs w:val="26"/>
           <w:rtl w:val="0"/>
         </w:rPr>
         <w:t xml:space="preserve">{{NAME}}</w:t>
@@ -837,29 +691,19 @@
       <w:r>
         <w:rPr>
           <w:rFonts w:ascii="Nirmala UI" w:cs="Nirmala UI" w:eastAsia="Nirmala UI" w:hAnsi="Nirmala UI"/>
-          <w:rtl w:val="0"/>
-        </w:rPr>
-        <w:t xml:space="preserve"> मनोनीत</w:t>
-      </w:r>
-      <w:r>
-        <w:rPr>
-          <w:rFonts w:ascii="Kruti Dev 010" w:cs="Kruti Dev 010" w:eastAsia="Kruti Dev 010" w:hAnsi="Kruti Dev 010"/>
-          <w:rtl w:val="0"/>
-        </w:rPr>
-        <w:t xml:space="preserve"> </w:t>
-      </w:r>
-      <w:r>
-        <w:rPr>
-          <w:rFonts w:ascii="Nirmala UI" w:cs="Nirmala UI" w:eastAsia="Nirmala UI" w:hAnsi="Nirmala UI"/>
-          <w:rtl w:val="0"/>
-        </w:rPr>
-        <w:t xml:space="preserve">{{DESIGNATION}}, “</w:t>
-      </w:r>
-      <w:r>
-        <w:rPr>
-          <w:rFonts w:ascii="Nirmala UI" w:cs="Nirmala UI" w:eastAsia="Nirmala UI" w:hAnsi="Nirmala UI"/>
-          <w:b w:val="1"/>
-          <w:bCs w:val="1"/>
+          <w:sz w:val="26"/>
+          <w:szCs w:val="26"/>
+          <w:rtl w:val="0"/>
+        </w:rPr>
+        <w:t xml:space="preserve"> मनोनीत {{DESIGNATION}}, “</w:t>
+      </w:r>
+      <w:r>
+        <w:rPr>
+          <w:rFonts w:ascii="Nirmala UI" w:cs="Nirmala UI" w:eastAsia="Nirmala UI" w:hAnsi="Nirmala UI"/>
+          <w:b w:val="1"/>
+          <w:bCs w:val="1"/>
+          <w:sz w:val="26"/>
+          <w:szCs w:val="26"/>
           <w:rtl w:val="0"/>
         </w:rPr>
         <w:t xml:space="preserve">{{ASSOCIATION}}</w:t>
@@ -867,24 +711,27 @@
       <w:r>
         <w:rPr>
           <w:rFonts w:ascii="Nirmala UI" w:cs="Nirmala UI" w:eastAsia="Nirmala UI" w:hAnsi="Nirmala UI"/>
-          <w:rtl w:val="0"/>
-        </w:rPr>
-        <w:t xml:space="preserve">”मध्यप्रदेश प्रकोष्ठ स्वामित्व अधिनियम</w:t>
-      </w:r>
-      <w:r>
-        <w:rPr>
-          <w:rFonts w:ascii="Kruti Dev 010" w:cs="Kruti Dev 010" w:eastAsia="Kruti Dev 010" w:hAnsi="Kruti Dev 010"/>
-          <w:rtl w:val="0"/>
-        </w:rPr>
-        <w:t xml:space="preserve"> </w:t>
-      </w:r>
-      <w:r>
-        <w:rPr>
-          <w:rFonts w:ascii="Nirmala UI" w:cs="Nirmala UI" w:eastAsia="Nirmala UI" w:hAnsi="Nirmala UI"/>
-          <w:rtl w:val="0"/>
-        </w:rPr>
-        <w:t xml:space="preserve">के सभी नियमों का पूर्ण रूप से पालन करूँगा </w:t>
-      </w:r>
+          <w:sz w:val="26"/>
+          <w:szCs w:val="26"/>
+          <w:rtl w:val="0"/>
+        </w:rPr>
+        <w:t xml:space="preserve">”मध्यप्रदेश प्रकोष्ठ स्वामित्व अधिनियम के सभी नियमों का पूर्ण रूप से पालन करूँगा |</w:t>
+      </w:r>
+    </w:p>
+    <w:p>
+      <w:pPr>
+        <w:tabs>
+          <w:tab w:val="left" w:leader="none" w:pos="720"/>
+        </w:tabs>
+        <w:spacing w:after="0" w:line="276" w:lineRule="auto"/>
+        <w:ind w:left="1080" w:right="90" w:firstLine="0"/>
+        <w:jc w:val="both"/>
+        <w:rPr>
+          <w:rFonts w:ascii="Nirmala UI" w:cs="Nirmala UI" w:eastAsia="Nirmala UI" w:hAnsi="Nirmala UI"/>
+          <w:sz w:val="26"/>
+          <w:szCs w:val="26"/>
+        </w:rPr>
+      </w:pPr>
       <w:r>
         <w:rPr>
           <w:rtl w:val="0"/>
@@ -897,16 +744,19 @@
           <w:ilvl w:val="0"/>
           <w:numId w:val="1"/>
         </w:numPr>
+        <w:tabs>
+          <w:tab w:val="left" w:leader="none" w:pos="720"/>
+        </w:tabs>
         <w:spacing w:after="0" w:line="276" w:lineRule="auto"/>
-        <w:ind w:left="720" w:firstLine="0"/>
+        <w:ind w:left="1080" w:right="90" w:hanging="360"/>
         <w:jc w:val="both"/>
         <w:rPr/>
       </w:pPr>
-      <w:bookmarkStart w:colFirst="0" w:colLast="0" w:name="_heading=h.bzdx5ckhs25y" w:id="6"/>
-      <w:bookmarkEnd w:id="6"/>
-      <w:r>
-        <w:rPr>
-          <w:rFonts w:ascii="Nirmala UI" w:cs="Nirmala UI" w:eastAsia="Nirmala UI" w:hAnsi="Nirmala UI"/>
+      <w:r>
+        <w:rPr>
+          <w:rFonts w:ascii="Nirmala UI" w:cs="Nirmala UI" w:eastAsia="Nirmala UI" w:hAnsi="Nirmala UI"/>
+          <w:sz w:val="26"/>
+          <w:szCs w:val="26"/>
           <w:rtl w:val="0"/>
         </w:rPr>
         <w:t xml:space="preserve">यह शपथ पत्र मैंने “</w:t>
@@ -916,6 +766,8 @@
           <w:rFonts w:ascii="Nirmala UI" w:cs="Nirmala UI" w:eastAsia="Nirmala UI" w:hAnsi="Nirmala UI"/>
           <w:b w:val="1"/>
           <w:bCs w:val="1"/>
+          <w:sz w:val="26"/>
+          <w:szCs w:val="26"/>
           <w:rtl w:val="0"/>
         </w:rPr>
         <w:t xml:space="preserve">{{ASSOCIATION}}</w:t>
@@ -923,23 +775,248 @@
       <w:r>
         <w:rPr>
           <w:rFonts w:ascii="Nirmala UI" w:cs="Nirmala UI" w:eastAsia="Nirmala UI" w:hAnsi="Nirmala UI"/>
-          <w:rtl w:val="0"/>
-        </w:rPr>
-        <w:t xml:space="preserve"> ” का पंजीयन किये जाने बाबद उपरोक्त समस्त कथन में दिया हैं |</w:t>
-      </w:r>
-      <w:r>
+          <w:sz w:val="26"/>
+          <w:szCs w:val="26"/>
+          <w:rtl w:val="0"/>
+        </w:rPr>
+        <w:t xml:space="preserve"> ” का पंजीयन किये जाने बाबद उपरोक्त समस्त कथन में दिया हैं | सो सही ताकि प्रमाण रहे |</w:t>
+      </w:r>
+      <w:r>
+        <w:rPr>
+          <w:rtl w:val="0"/>
+        </w:rPr>
+      </w:r>
+    </w:p>
+    <w:p>
+      <w:pPr>
+        <w:spacing w:after="0" w:line="276" w:lineRule="auto"/>
+        <w:ind w:right="90" w:firstLine="720"/>
+        <w:jc w:val="both"/>
         <w:rPr>
           <w:rFonts w:ascii="Kruti Dev 010" w:cs="Kruti Dev 010" w:eastAsia="Kruti Dev 010" w:hAnsi="Kruti Dev 010"/>
-          <w:rtl w:val="0"/>
-        </w:rPr>
+        </w:rPr>
+      </w:pPr>
+      <w:r>
+        <w:rPr>
+          <w:rtl w:val="0"/>
+        </w:rPr>
+      </w:r>
+    </w:p>
+    <w:p>
+      <w:pPr>
+        <w:spacing w:after="0" w:line="240" w:lineRule="auto"/>
+        <w:ind w:left="360" w:right="90" w:firstLine="360"/>
+        <w:jc w:val="both"/>
+        <w:rPr>
+          <w:rFonts w:ascii="Kruti Dev 010" w:cs="Kruti Dev 010" w:eastAsia="Kruti Dev 010" w:hAnsi="Kruti Dev 010"/>
+        </w:rPr>
+      </w:pPr>
+      <w:r>
+        <w:rPr>
+          <w:rFonts w:ascii="Nirmala UI" w:cs="Nirmala UI" w:eastAsia="Nirmala UI" w:hAnsi="Nirmala UI"/>
+          <w:sz w:val="26"/>
+          <w:szCs w:val="26"/>
+          <w:rtl w:val="0"/>
+        </w:rPr>
+        <w:t xml:space="preserve">           </w:t>
+        <w:tab/>
+        <w:tab/>
+        <w:tab/>
+        <w:tab/>
+        <w:tab/>
+        <w:tab/>
+        <w:tab/>
+        <w:tab/>
         <w:t xml:space="preserve"> </w:t>
-      </w:r>
-      <w:r>
-        <w:rPr>
-          <w:rFonts w:ascii="Nirmala UI" w:cs="Nirmala UI" w:eastAsia="Nirmala UI" w:hAnsi="Nirmala UI"/>
-          <w:rtl w:val="0"/>
-        </w:rPr>
-        <w:t xml:space="preserve">सो सही ताकि प्रमाण रहे |</w:t>
+        <w:tab/>
+      </w:r>
+      <w:r>
+        <w:rPr>
+          <w:rtl w:val="0"/>
+        </w:rPr>
+      </w:r>
+    </w:p>
+    <w:p>
+      <w:pPr>
+        <w:spacing w:after="200" w:line="240" w:lineRule="auto"/>
+        <w:ind w:left="360" w:right="90" w:firstLine="360"/>
+        <w:jc w:val="both"/>
+        <w:rPr>
+          <w:rFonts w:ascii="Mangal" w:cs="Mangal" w:eastAsia="Mangal" w:hAnsi="Mangal"/>
+        </w:rPr>
+      </w:pPr>
+      <w:r>
+        <w:rPr>
+          <w:rFonts w:ascii="Nirmala UI" w:cs="Nirmala UI" w:eastAsia="Nirmala UI" w:hAnsi="Nirmala UI"/>
+          <w:b w:val="1"/>
+          <w:bCs w:val="1"/>
+          <w:sz w:val="26"/>
+          <w:szCs w:val="26"/>
+          <w:rtl w:val="0"/>
+        </w:rPr>
+        <w:t xml:space="preserve">दिनांक {{DATE}}</w:t>
+        <w:tab/>
+        <w:t xml:space="preserve">                                                                             {{NAME}}</w:t>
+      </w:r>
+      <w:r>
+        <w:rPr>
+          <w:rtl w:val="0"/>
+        </w:rPr>
+      </w:r>
+    </w:p>
+    <w:p>
+      <w:pPr>
+        <w:spacing w:after="200" w:line="240" w:lineRule="auto"/>
+        <w:ind w:left="720" w:right="90" w:firstLine="0"/>
+        <w:jc w:val="both"/>
+        <w:rPr>
+          <w:rFonts w:ascii="Nirmala UI" w:cs="Nirmala UI" w:eastAsia="Nirmala UI" w:hAnsi="Nirmala UI"/>
+        </w:rPr>
+      </w:pPr>
+      <w:r>
+        <w:rPr>
+          <w:rFonts w:ascii="Nirmala UI" w:cs="Nirmala UI" w:eastAsia="Nirmala UI" w:hAnsi="Nirmala UI"/>
+          <w:b w:val="1"/>
+          <w:bCs w:val="1"/>
+          <w:sz w:val="26"/>
+          <w:szCs w:val="26"/>
+          <w:rtl w:val="0"/>
+        </w:rPr>
+        <w:t xml:space="preserve">स्थान</w:t>
+      </w:r>
+      <w:r>
+        <w:rPr>
+          <w:rFonts w:ascii="Nirmala UI" w:cs="Nirmala UI" w:eastAsia="Nirmala UI" w:hAnsi="Nirmala UI"/>
+          <w:sz w:val="26"/>
+          <w:szCs w:val="26"/>
+          <w:rtl w:val="0"/>
+        </w:rPr>
+        <w:t xml:space="preserve">  -  </w:t>
+      </w:r>
+      <w:r>
+        <w:rPr>
+          <w:rFonts w:ascii="Nirmala UI" w:cs="Nirmala UI" w:eastAsia="Nirmala UI" w:hAnsi="Nirmala UI"/>
+          <w:b w:val="1"/>
+          <w:bCs w:val="1"/>
+          <w:sz w:val="26"/>
+          <w:szCs w:val="26"/>
+          <w:rtl w:val="0"/>
+        </w:rPr>
+        <w:t xml:space="preserve">{{CITY}}</w:t>
+      </w:r>
+      <w:r>
+        <w:rPr>
+          <w:rFonts w:ascii="Nirmala UI" w:cs="Nirmala UI" w:eastAsia="Nirmala UI" w:hAnsi="Nirmala UI"/>
+          <w:sz w:val="26"/>
+          <w:szCs w:val="26"/>
+          <w:rtl w:val="0"/>
+        </w:rPr>
+        <w:tab/>
+        <w:t xml:space="preserve">                                                                  </w:t>
+      </w:r>
+      <w:r>
+        <w:rPr>
+          <w:rFonts w:ascii="Nirmala UI" w:cs="Nirmala UI" w:eastAsia="Nirmala UI" w:hAnsi="Nirmala UI"/>
+          <w:b w:val="1"/>
+          <w:bCs w:val="1"/>
+          <w:sz w:val="26"/>
+          <w:szCs w:val="26"/>
+          <w:rtl w:val="0"/>
+        </w:rPr>
+        <w:t xml:space="preserve">मनोनीत {{DESIGNATION}}</w:t>
+      </w:r>
+      <w:r>
+        <w:rPr>
+          <w:rtl w:val="0"/>
+        </w:rPr>
+      </w:r>
+    </w:p>
+    <w:p>
+      <w:pPr>
+        <w:pageBreakBefore w:val="1"/>
+        <w:spacing w:after="200" w:line="276" w:lineRule="auto"/>
+        <w:ind w:left="4320" w:right="90" w:firstLine="0"/>
+        <w:jc w:val="left"/>
+        <w:rPr>
+          <w:rFonts w:ascii="Nirmala UI" w:cs="Nirmala UI" w:eastAsia="Nirmala UI" w:hAnsi="Nirmala UI"/>
+          <w:b w:val="1"/>
+          <w:bCs w:val="1"/>
+          <w:sz w:val="36"/>
+          <w:szCs w:val="36"/>
+          <w:u w:val="single"/>
+        </w:rPr>
+      </w:pPr>
+      <w:r>
+        <w:rPr>
+          <w:rtl w:val="0"/>
+        </w:rPr>
+      </w:r>
+    </w:p>
+    <w:p>
+      <w:pPr>
+        <w:spacing w:after="200" w:line="276" w:lineRule="auto"/>
+        <w:ind w:left="3600" w:right="90" w:firstLine="720"/>
+        <w:jc w:val="left"/>
+        <w:rPr>
+          <w:rFonts w:ascii="Nirmala UI" w:cs="Nirmala UI" w:eastAsia="Nirmala UI" w:hAnsi="Nirmala UI"/>
+          <w:b w:val="1"/>
+          <w:bCs w:val="1"/>
+          <w:u w:val="single"/>
+        </w:rPr>
+      </w:pPr>
+      <w:r>
+        <w:rPr>
+          <w:rFonts w:ascii="Nirmala UI" w:cs="Nirmala UI" w:eastAsia="Nirmala UI" w:hAnsi="Nirmala UI"/>
+          <w:b w:val="1"/>
+          <w:bCs w:val="1"/>
+          <w:sz w:val="36"/>
+          <w:szCs w:val="36"/>
+          <w:u w:val="single"/>
+          <w:rtl w:val="0"/>
+        </w:rPr>
+        <w:t xml:space="preserve">सत्यापन लेख</w:t>
+      </w:r>
+      <w:r>
+        <w:rPr>
+          <w:rtl w:val="0"/>
+        </w:rPr>
+      </w:r>
+    </w:p>
+    <w:p>
+      <w:pPr>
+        <w:spacing w:after="200" w:line="276" w:lineRule="auto"/>
+        <w:ind w:left="4320" w:right="90" w:firstLine="720"/>
+        <w:jc w:val="left"/>
+        <w:rPr>
+          <w:rFonts w:ascii="Nirmala UI" w:cs="Nirmala UI" w:eastAsia="Nirmala UI" w:hAnsi="Nirmala UI"/>
+          <w:b w:val="1"/>
+          <w:bCs w:val="1"/>
+          <w:u w:val="single"/>
+        </w:rPr>
+      </w:pPr>
+      <w:r>
+        <w:rPr>
+          <w:rtl w:val="0"/>
+        </w:rPr>
+      </w:r>
+    </w:p>
+    <w:p>
+      <w:pPr>
+        <w:spacing w:after="200" w:line="276" w:lineRule="auto"/>
+        <w:ind w:left="720" w:right="90" w:firstLine="0"/>
+        <w:jc w:val="both"/>
+        <w:rPr>
+          <w:rFonts w:ascii="Kruti Dev 010" w:cs="Kruti Dev 010" w:eastAsia="Kruti Dev 010" w:hAnsi="Kruti Dev 010"/>
+        </w:rPr>
+      </w:pPr>
+      <w:r>
+        <w:rPr>
+          <w:rFonts w:ascii="Nirmala UI" w:cs="Nirmala UI" w:eastAsia="Nirmala UI" w:hAnsi="Nirmala UI"/>
+          <w:sz w:val="26"/>
+          <w:szCs w:val="26"/>
+          <w:rtl w:val="0"/>
+        </w:rPr>
+        <w:t xml:space="preserve">मैं शपथपूर्वक उपरोक्त कथन सत्यापित करता/ करती हूँ कि उपरोक्त शपथ पत्र का समस्त कथन मेरी निजी जानकारी एवं विश्वास से सत्य एवं सही है, इसमें कुछ भी असत्य कथन नही किया गया होकर किसी भी तथ्यगत बात को छुपाया नहीं गया है| आज दिनांक {{DATE}}को जिला {{CITY}} में मेने इस पर अपने हस्ताक्षर करके इसे सत्यापित किय है|</w:t>
       </w:r>
       <w:r>
         <w:rPr>
@@ -950,301 +1027,12 @@
     <w:p>
       <w:pPr>
         <w:spacing w:after="0" w:line="276" w:lineRule="auto"/>
-        <w:ind w:firstLine="720"/>
-        <w:jc w:val="both"/>
-        <w:rPr>
-          <w:rFonts w:ascii="Kruti Dev 010" w:cs="Kruti Dev 010" w:eastAsia="Kruti Dev 010" w:hAnsi="Kruti Dev 010"/>
-        </w:rPr>
-      </w:pPr>
-      <w:r>
-        <w:rPr>
-          <w:rtl w:val="0"/>
-        </w:rPr>
-      </w:r>
-    </w:p>
-    <w:p>
-      <w:pPr>
-        <w:spacing w:after="0" w:line="240" w:lineRule="auto"/>
-        <w:ind w:left="360" w:firstLine="360"/>
-        <w:jc w:val="both"/>
-        <w:rPr>
-          <w:rFonts w:ascii="Kruti Dev 010" w:cs="Kruti Dev 010" w:eastAsia="Kruti Dev 010" w:hAnsi="Kruti Dev 010"/>
-        </w:rPr>
-      </w:pPr>
-      <w:r>
-        <w:rPr>
-          <w:rFonts w:ascii="Nirmala UI" w:cs="Nirmala UI" w:eastAsia="Nirmala UI" w:hAnsi="Nirmala UI"/>
-          <w:rtl w:val="0"/>
-        </w:rPr>
-        <w:t xml:space="preserve">           </w:t>
-        <w:tab/>
-        <w:tab/>
-        <w:tab/>
-        <w:tab/>
-        <w:tab/>
-        <w:tab/>
-        <w:tab/>
-        <w:tab/>
-        <w:t xml:space="preserve"> </w:t>
-        <w:tab/>
-      </w:r>
-      <w:r>
-        <w:rPr>
-          <w:rtl w:val="0"/>
-        </w:rPr>
-      </w:r>
-    </w:p>
-    <w:p>
-      <w:pPr>
-        <w:spacing w:after="200" w:line="240" w:lineRule="auto"/>
-        <w:ind w:left="360" w:firstLine="360"/>
-        <w:jc w:val="both"/>
-        <w:rPr>
-          <w:rFonts w:ascii="Mangal" w:cs="Mangal" w:eastAsia="Mangal" w:hAnsi="Mangal"/>
-        </w:rPr>
-      </w:pPr>
-      <w:r>
-        <w:rPr>
-          <w:rFonts w:ascii="Mangal" w:cs="Mangal" w:eastAsia="Mangal" w:hAnsi="Mangal"/>
-          <w:b w:val="1"/>
-          <w:bCs w:val="1"/>
-          <w:rtl w:val="0"/>
-        </w:rPr>
-        <w:t xml:space="preserve">दिनांक {{DATE}}</w:t>
-        <w:tab/>
-        <w:t xml:space="preserve">                                                                                      </w:t>
-      </w:r>
-      <w:r>
-        <w:rPr>
-          <w:rFonts w:ascii="Nirmala UI" w:cs="Nirmala UI" w:eastAsia="Nirmala UI" w:hAnsi="Nirmala UI"/>
-          <w:b w:val="1"/>
-          <w:bCs w:val="1"/>
-          <w:rtl w:val="0"/>
-        </w:rPr>
-        <w:t xml:space="preserve">{{NAME}}</w:t>
-      </w:r>
-      <w:r>
-        <w:rPr>
-          <w:rtl w:val="0"/>
-        </w:rPr>
-      </w:r>
-    </w:p>
-    <w:p>
-      <w:pPr>
-        <w:spacing w:after="200" w:line="240" w:lineRule="auto"/>
-        <w:ind w:left="720" w:firstLine="0"/>
-        <w:jc w:val="both"/>
-        <w:rPr>
-          <w:rFonts w:ascii="Nirmala UI" w:cs="Nirmala UI" w:eastAsia="Nirmala UI" w:hAnsi="Nirmala UI"/>
-        </w:rPr>
-      </w:pPr>
-      <w:r>
-        <w:rPr>
-          <w:rFonts w:ascii="Mangal" w:cs="Mangal" w:eastAsia="Mangal" w:hAnsi="Mangal"/>
-          <w:b w:val="1"/>
-          <w:bCs w:val="1"/>
-          <w:rtl w:val="0"/>
-        </w:rPr>
-        <w:t xml:space="preserve">स्थान</w:t>
-      </w:r>
-      <w:r>
-        <w:rPr>
-          <w:rFonts w:ascii="Kruti Dev 010" w:cs="Kruti Dev 010" w:eastAsia="Kruti Dev 010" w:hAnsi="Kruti Dev 010"/>
-          <w:rtl w:val="0"/>
-        </w:rPr>
-        <w:t xml:space="preserve">  -  </w:t>
-      </w:r>
-      <w:r>
-        <w:rPr>
-          <w:rFonts w:ascii="Mangal" w:cs="Mangal" w:eastAsia="Mangal" w:hAnsi="Mangal"/>
-          <w:b w:val="1"/>
-          <w:bCs w:val="1"/>
-          <w:rtl w:val="0"/>
-        </w:rPr>
-        <w:t xml:space="preserve">{{CITY}}</w:t>
-      </w:r>
-      <w:r>
-        <w:rPr>
-          <w:rFonts w:ascii="Kruti Dev 010" w:cs="Kruti Dev 010" w:eastAsia="Kruti Dev 010" w:hAnsi="Kruti Dev 010"/>
-          <w:rtl w:val="0"/>
-        </w:rPr>
-        <w:tab/>
-        <w:t xml:space="preserve">                                                                  </w:t>
-      </w:r>
-      <w:r>
-        <w:rPr>
-          <w:rFonts w:ascii="Mangal" w:cs="Mangal" w:eastAsia="Mangal" w:hAnsi="Mangal"/>
-          <w:b w:val="1"/>
-          <w:bCs w:val="1"/>
-          <w:rtl w:val="0"/>
-        </w:rPr>
-        <w:t xml:space="preserve">मनोनीत {{DESIGNATION}}</w:t>
-      </w:r>
-      <w:r>
-        <w:rPr>
-          <w:rtl w:val="0"/>
-        </w:rPr>
-      </w:r>
-    </w:p>
-    <w:p>
-      <w:pPr>
-        <w:spacing w:after="200" w:line="276" w:lineRule="auto"/>
-        <w:ind w:left="360" w:firstLine="0"/>
-        <w:jc w:val="center"/>
-        <w:rPr>
-          <w:rFonts w:ascii="Kruti Dev 010" w:cs="Kruti Dev 010" w:eastAsia="Kruti Dev 010" w:hAnsi="Kruti Dev 010"/>
-          <w:u w:val="single"/>
-        </w:rPr>
-      </w:pPr>
-      <w:r>
-        <w:rPr>
-          <w:rtl w:val="0"/>
-        </w:rPr>
-      </w:r>
-    </w:p>
-    <w:p>
-      <w:pPr>
-        <w:spacing w:after="200" w:line="276" w:lineRule="auto"/>
-        <w:ind w:left="0" w:firstLine="0"/>
-        <w:jc w:val="left"/>
-        <w:rPr>
-          <w:rFonts w:ascii="Kruti Dev 010" w:cs="Kruti Dev 010" w:eastAsia="Kruti Dev 010" w:hAnsi="Kruti Dev 010"/>
-          <w:u w:val="single"/>
-        </w:rPr>
-      </w:pPr>
-      <w:r>
-        <w:rPr>
-          <w:rtl w:val="0"/>
-        </w:rPr>
-      </w:r>
-    </w:p>
-    <w:p>
-      <w:pPr>
-        <w:spacing w:after="200" w:line="276" w:lineRule="auto"/>
-        <w:ind w:left="0" w:firstLine="0"/>
-        <w:jc w:val="left"/>
-        <w:rPr>
-          <w:rFonts w:ascii="Kruti Dev 010" w:cs="Kruti Dev 010" w:eastAsia="Kruti Dev 010" w:hAnsi="Kruti Dev 010"/>
-          <w:u w:val="single"/>
-        </w:rPr>
-      </w:pPr>
-      <w:r>
-        <w:rPr>
-          <w:rtl w:val="0"/>
-        </w:rPr>
-      </w:r>
-    </w:p>
-    <w:p>
-      <w:pPr>
-        <w:spacing w:after="200" w:line="276" w:lineRule="auto"/>
-        <w:ind w:left="5040" w:firstLine="0"/>
-        <w:jc w:val="left"/>
-        <w:rPr>
-          <w:rFonts w:ascii="Nirmala UI" w:cs="Nirmala UI" w:eastAsia="Nirmala UI" w:hAnsi="Nirmala UI"/>
-          <w:b w:val="1"/>
-          <w:bCs w:val="1"/>
-          <w:u w:val="single"/>
-        </w:rPr>
-      </w:pPr>
-      <w:r>
-        <w:rPr>
-          <w:rtl w:val="0"/>
-        </w:rPr>
-      </w:r>
-    </w:p>
-    <w:p>
-      <w:pPr>
-        <w:spacing w:after="200" w:line="276" w:lineRule="auto"/>
-        <w:ind w:left="4320" w:firstLine="720"/>
-        <w:jc w:val="left"/>
-        <w:rPr>
-          <w:rFonts w:ascii="Nirmala UI" w:cs="Nirmala UI" w:eastAsia="Nirmala UI" w:hAnsi="Nirmala UI"/>
-          <w:b w:val="1"/>
-          <w:bCs w:val="1"/>
-          <w:u w:val="single"/>
-        </w:rPr>
-      </w:pPr>
-      <w:r>
-        <w:rPr>
-          <w:rtl w:val="0"/>
-        </w:rPr>
-      </w:r>
-    </w:p>
-    <w:p>
-      <w:pPr>
-        <w:spacing w:after="200" w:line="276" w:lineRule="auto"/>
-        <w:ind w:left="4320" w:firstLine="720"/>
-        <w:jc w:val="left"/>
-        <w:rPr>
-          <w:rFonts w:ascii="Nirmala UI" w:cs="Nirmala UI" w:eastAsia="Nirmala UI" w:hAnsi="Nirmala UI"/>
-          <w:b w:val="1"/>
-          <w:bCs w:val="1"/>
-          <w:u w:val="single"/>
-        </w:rPr>
-      </w:pPr>
-      <w:r>
-        <w:rPr>
-          <w:rtl w:val="0"/>
-        </w:rPr>
-      </w:r>
-    </w:p>
-    <w:p>
-      <w:pPr>
-        <w:spacing w:after="200" w:line="276" w:lineRule="auto"/>
-        <w:ind w:left="4320" w:firstLine="720"/>
-        <w:jc w:val="left"/>
-        <w:rPr>
-          <w:rFonts w:ascii="Nirmala UI" w:cs="Nirmala UI" w:eastAsia="Nirmala UI" w:hAnsi="Nirmala UI"/>
-          <w:b w:val="1"/>
-          <w:bCs w:val="1"/>
-          <w:u w:val="single"/>
-        </w:rPr>
-      </w:pPr>
-      <w:r>
-        <w:rPr>
-          <w:rFonts w:ascii="Nirmala UI" w:cs="Nirmala UI" w:eastAsia="Nirmala UI" w:hAnsi="Nirmala UI"/>
-          <w:b w:val="1"/>
-          <w:bCs w:val="1"/>
-          <w:u w:val="single"/>
-          <w:rtl w:val="0"/>
-        </w:rPr>
-        <w:t xml:space="preserve">सत्यापन लेख</w:t>
-      </w:r>
-    </w:p>
-    <w:p>
-      <w:pPr>
-        <w:spacing w:after="200" w:line="276" w:lineRule="auto"/>
-        <w:ind w:left="4320" w:firstLine="720"/>
-        <w:jc w:val="left"/>
-        <w:rPr>
-          <w:rFonts w:ascii="Nirmala UI" w:cs="Nirmala UI" w:eastAsia="Nirmala UI" w:hAnsi="Nirmala UI"/>
-          <w:b w:val="1"/>
-          <w:bCs w:val="1"/>
-          <w:u w:val="single"/>
-        </w:rPr>
-      </w:pPr>
-      <w:r>
-        <w:rPr>
-          <w:rtl w:val="0"/>
-        </w:rPr>
-      </w:r>
-    </w:p>
-    <w:p>
-      <w:pPr>
-        <w:spacing w:after="200" w:line="276" w:lineRule="auto"/>
-        <w:ind w:left="720" w:firstLine="0"/>
-        <w:jc w:val="both"/>
-        <w:rPr>
-          <w:rFonts w:ascii="Kruti Dev 010" w:cs="Kruti Dev 010" w:eastAsia="Kruti Dev 010" w:hAnsi="Kruti Dev 010"/>
-        </w:rPr>
-      </w:pPr>
-      <w:r>
-        <w:rPr>
-          <w:rFonts w:ascii="Nirmala UI" w:cs="Nirmala UI" w:eastAsia="Nirmala UI" w:hAnsi="Nirmala UI"/>
-          <w:rtl w:val="0"/>
-        </w:rPr>
-        <w:t xml:space="preserve">मैं शपथपूर्वक उपरोक्त कथन सत्यापित करता/ करती हूँ कि उपरोक्त शपथ पत्र का समस्त कथन मेरी निजी जानकारी एवं विश्वास से सत्य एवं सही है, इसमें कुछ भी असत्य कथन नही किया गया होकर किसी भी तथ्यगत बात को छुपाया नहीं गया है| आज दिनांक {{DATE}}को जिला {{CITY}} में मेने इस पर अपने हस्ताक्षर करके इसे सत्यापित किय है|</w:t>
-      </w:r>
+        <w:ind w:left="720" w:right="90" w:firstLine="0"/>
+        <w:jc w:val="both"/>
+        <w:rPr>
+          <w:rFonts w:ascii="Nirmala UI" w:cs="Nirmala UI" w:eastAsia="Nirmala UI" w:hAnsi="Nirmala UI"/>
+        </w:rPr>
+      </w:pPr>
       <w:r>
         <w:rPr>
           <w:rtl w:val="0"/>
@@ -1254,22 +1042,7 @@
     <w:p>
       <w:pPr>
         <w:spacing w:after="0" w:line="276" w:lineRule="auto"/>
-        <w:ind w:left="720" w:firstLine="0"/>
-        <w:jc w:val="both"/>
-        <w:rPr>
-          <w:rFonts w:ascii="Nirmala UI" w:cs="Nirmala UI" w:eastAsia="Nirmala UI" w:hAnsi="Nirmala UI"/>
-        </w:rPr>
-      </w:pPr>
-      <w:r>
-        <w:rPr>
-          <w:rtl w:val="0"/>
-        </w:rPr>
-      </w:r>
-    </w:p>
-    <w:p>
-      <w:pPr>
-        <w:spacing w:after="0" w:line="276" w:lineRule="auto"/>
-        <w:ind w:left="720" w:firstLine="0"/>
+        <w:ind w:left="720" w:right="90" w:firstLine="0"/>
         <w:jc w:val="both"/>
         <w:rPr>
           <w:rFonts w:ascii="Nirmala UI" w:cs="Nirmala UI" w:eastAsia="Nirmala UI" w:hAnsi="Nirmala UI"/>
@@ -1287,7 +1060,7 @@
           <w:tab w:val="right" w:leader="none" w:pos="10296"/>
         </w:tabs>
         <w:spacing w:after="0" w:line="240" w:lineRule="auto"/>
-        <w:ind w:left="720" w:right="-180" w:firstLine="0"/>
+        <w:ind w:left="720" w:right="90" w:firstLine="0"/>
         <w:jc w:val="both"/>
         <w:rPr>
           <w:rFonts w:ascii="Kruti Dev 010" w:cs="Kruti Dev 010" w:eastAsia="Kruti Dev 010" w:hAnsi="Kruti Dev 010"/>
@@ -1295,18 +1068,23 @@
       </w:pPr>
       <w:r>
         <w:rPr>
+          <w:rFonts w:ascii="Nirmala UI" w:cs="Nirmala UI" w:eastAsia="Nirmala UI" w:hAnsi="Nirmala UI"/>
+          <w:sz w:val="26"/>
+          <w:szCs w:val="26"/>
           <w:rtl w:val="0"/>
         </w:rPr>
         <w:t xml:space="preserve">दिनांक: {{DATE}}</w:t>
       </w:r>
       <w:r>
         <w:rPr>
-          <w:b w:val="1"/>
-          <w:bCs w:val="1"/>
-          <w:rtl w:val="0"/>
-        </w:rPr>
-        <w:tab/>
-        <w:t xml:space="preserve">{{NAME}}</w:t>
+          <w:rFonts w:ascii="Nirmala UI" w:cs="Nirmala UI" w:eastAsia="Nirmala UI" w:hAnsi="Nirmala UI"/>
+          <w:b w:val="1"/>
+          <w:bCs w:val="1"/>
+          <w:sz w:val="26"/>
+          <w:szCs w:val="26"/>
+          <w:rtl w:val="0"/>
+        </w:rPr>
+        <w:t xml:space="preserve">                                                                              {{NAME}}</w:t>
       </w:r>
       <w:r>
         <w:rPr>
@@ -1320,7 +1098,7 @@
           <w:tab w:val="right" w:leader="none" w:pos="10296"/>
         </w:tabs>
         <w:spacing w:after="0" w:line="240" w:lineRule="auto"/>
-        <w:ind w:left="720" w:right="-180" w:firstLine="0"/>
+        <w:ind w:left="720" w:right="90" w:firstLine="0"/>
         <w:jc w:val="both"/>
         <w:rPr>
           <w:rFonts w:ascii="Kruti Dev 010" w:cs="Kruti Dev 010" w:eastAsia="Kruti Dev 010" w:hAnsi="Kruti Dev 010"/>
@@ -1328,18 +1106,23 @@
       </w:pPr>
       <w:r>
         <w:rPr>
+          <w:rFonts w:ascii="Nirmala UI" w:cs="Nirmala UI" w:eastAsia="Nirmala UI" w:hAnsi="Nirmala UI"/>
+          <w:sz w:val="26"/>
+          <w:szCs w:val="26"/>
           <w:rtl w:val="0"/>
         </w:rPr>
         <w:t xml:space="preserve">स्थान :   {{CITY}}</w:t>
       </w:r>
       <w:r>
         <w:rPr>
-          <w:b w:val="1"/>
-          <w:bCs w:val="1"/>
-          <w:rtl w:val="0"/>
-        </w:rPr>
-        <w:tab/>
-        <w:t xml:space="preserve">{{DESIGNATION}}</w:t>
+          <w:rFonts w:ascii="Nirmala UI" w:cs="Nirmala UI" w:eastAsia="Nirmala UI" w:hAnsi="Nirmala UI"/>
+          <w:b w:val="1"/>
+          <w:bCs w:val="1"/>
+          <w:sz w:val="26"/>
+          <w:szCs w:val="26"/>
+          <w:rtl w:val="0"/>
+        </w:rPr>
+        <w:t xml:space="preserve">                                                                        {{DESIGNATION}}</w:t>
       </w:r>
       <w:r>
         <w:rPr>
@@ -1353,14 +1136,17 @@
           <w:tab w:val="right" w:leader="none" w:pos="10296"/>
         </w:tabs>
         <w:spacing w:after="0" w:line="276" w:lineRule="auto"/>
-        <w:ind w:right="-180"/>
+        <w:ind w:right="90"/>
         <w:jc w:val="both"/>
         <w:rPr/>
       </w:pPr>
       <w:r>
         <w:rPr>
-          <w:b w:val="1"/>
-          <w:bCs w:val="1"/>
+          <w:rFonts w:ascii="Nirmala UI" w:cs="Nirmala UI" w:eastAsia="Nirmala UI" w:hAnsi="Nirmala UI"/>
+          <w:b w:val="1"/>
+          <w:bCs w:val="1"/>
+          <w:sz w:val="26"/>
+          <w:szCs w:val="26"/>
           <w:rtl w:val="0"/>
         </w:rPr>
         <w:tab/>
@@ -1616,6 +1402,20 @@
       <w:sz w:val="56"/>
       <w:szCs w:val="56"/>
     </w:rPr>
+  </w:style>
+  <w:style w:type="table" w:styleId="TableNormal" w:default="1">
+    <w:name w:val="TableNormal"/>
+    <w:tblPr>
+      <w:tblCellMar>
+        <w:top w:w="100.0" w:type="dxa"/>
+        <w:left w:w="100.0" w:type="dxa"/>
+        <w:bottom w:w="100.0" w:type="dxa"/>
+        <w:right w:w="100.0" w:type="dxa"/>
+      </w:tblCellMar>
+    </w:tblPr>
+  </w:style>
+  <w:style w:type="paragraph" w:styleId="Normal" w:default="1">
+    <w:name w:val="normal"/>
   </w:style>
   <w:style w:type="table" w:styleId="TableNormal" w:default="1">
     <w:name w:val="TableNormal"/>
@@ -2283,7 +2083,7 @@
 
 <file path=customXML/item1.xml><?xml version="1.0" encoding="utf-8"?>
 <go:gDocsCustomXmlDataStorage xmlns:go="http://customooxmlschemas.google.com/" xmlns:r="http://schemas.openxmlformats.org/officeDocument/2006/relationships" uri="GoogleDocsCustomDataVersion2">
-  <go:docsCustomData xmlns:go="http://customooxmlschemas.google.com/" roundtripDataSignature="AMtx7miLy/QtSGgaeXcrl73cIG8nnwGiAQ==">CgMxLjAyDmguamx2YjFlZjR6bDUzMg5oLjRzazgwbHZyNWk5dDIOaC40NWE5bXQ2a29oenYyDmgubngzNzlkdmc5aGF5Mg5oLjN3MzB3ZGx0eTlpbzIOaC52NTg3YnJmM3RhMXcyDmguYnpkeDVja2hzMjV5OAByITFMVzkxeFhJWlpoNURzUlQ5dU9PX3BDZXVlZV9kUkVfZg==</go:docsCustomData>
+  <go:docsCustomData xmlns:go="http://customooxmlschemas.google.com/" roundtripDataSignature="AMtx7mirVBUSbk+Tn7StgTkkajH0/TM9iQ==">CgMxLjAyDmguajhkanAyYzBuanVqMg5oLnFmNzBpcGJibzIwMDIOaC40NWE5bXQ2a29oenYyDmgubngzNzlkdmc5aGF5Mg5oLjN3MzB3ZGx0eTlpbzgAciExckQxVHNxZVZ1TlBWcGM4UEZ5XzJ5VEJlbkpqelY2ZGo=</go:docsCustomData>
 </go:gDocsCustomXmlDataStorage>
 </file>
 

</xml_diff>

<commit_message>
feat: complete six-document form-to-DOCX automation
Finalize NOC, affidavit, consent, registration, by-law, and Form-A workflows with updated Google Form contracts, association-address migrations, dynamic member handling, validated templates, live Sheets integration, and regression coverage.
</commit_message>
<xml_diff>
--- a/templates/Affidavit_Template.docx
+++ b/templates/Affidavit_Template.docx
@@ -327,37 +327,27 @@
           <w:szCs w:val="26"/>
           <w:rtl w:val="0"/>
         </w:rPr>
-        <w:t xml:space="preserve"> जो की खसरा नंबर </w:t>
-      </w:r>
-      <w:r>
-        <w:rPr>
-          <w:rFonts w:ascii="Nirmala UI" w:cs="Nirmala UI" w:eastAsia="Nirmala UI" w:hAnsi="Nirmala UI"/>
-          <w:color w:val="000000"/>
-          <w:sz w:val="26"/>
-          <w:szCs w:val="26"/>
-          <w:rtl w:val="0"/>
-        </w:rPr>
-        <w:t xml:space="preserve">खसरा नंबर </w:t>
-      </w:r>
-      <w:r>
-        <w:rPr>
-          <w:rFonts w:ascii="Nirmala UI" w:cs="Nirmala UI" w:eastAsia="Nirmala UI" w:hAnsi="Nirmala UI"/>
-          <w:b w:val="1"/>
-          <w:bCs w:val="1"/>
-          <w:sz w:val="26"/>
-          <w:szCs w:val="26"/>
-          <w:rtl w:val="0"/>
-        </w:rPr>
-        <w:t xml:space="preserve">{{LAND}}</w:t>
-      </w:r>
-      <w:r>
-        <w:rPr>
-          <w:rFonts w:ascii="Nirmala UI" w:cs="Nirmala UI" w:eastAsia="Nirmala UI" w:hAnsi="Nirmala UI"/>
-          <w:sz w:val="26"/>
-          <w:szCs w:val="26"/>
-          <w:rtl w:val="0"/>
-        </w:rPr>
-        <w:t xml:space="preserve"> {{PROJECT_LOCATION}} विकसित की गई है, जिसका रेरा पंजीयन क्रमांक </w:t>
+        <w:t xml:space="preserve"> जो की </w:t>
+      </w:r>
+      <w:r>
+        <w:rPr>
+          <w:rFonts w:ascii="Nirmala UI" w:cs="Nirmala UI" w:eastAsia="Nirmala UI" w:hAnsi="Nirmala UI"/>
+          <w:b w:val="1"/>
+          <w:bCs w:val="1"/>
+          <w:sz w:val="26"/>
+          <w:szCs w:val="26"/>
+          <w:rtl w:val="0"/>
+        </w:rPr>
+        <w:t xml:space="preserve">{{association_address}}</w:t>
+      </w:r>
+      <w:r>
+        <w:rPr>
+          <w:rFonts w:ascii="Nirmala UI" w:cs="Nirmala UI" w:eastAsia="Nirmala UI" w:hAnsi="Nirmala UI"/>
+          <w:sz w:val="26"/>
+          <w:szCs w:val="26"/>
+          <w:rtl w:val="0"/>
+        </w:rPr>
+        <w:t xml:space="preserve"> विकसित की गई है, जिसका रेरा पंजीयन क्रमांक </w:t>
       </w:r>
       <w:r>
         <w:rPr>
@@ -490,7 +480,7 @@
           <w:szCs w:val="26"/>
           <w:rtl w:val="0"/>
         </w:rPr>
-        <w:t xml:space="preserve">{{ASSOCIATION}}</w:t>
+        <w:t xml:space="preserve">{{ASSOCIATION_NAME}}</w:t>
       </w:r>
       <w:r>
         <w:rPr>
@@ -511,7 +501,7 @@
           <w:szCs w:val="26"/>
           <w:rtl w:val="0"/>
         </w:rPr>
-        <w:t xml:space="preserve">{{ASSOCIATION}}</w:t>
+        <w:t xml:space="preserve">{{ASSOCIATION_NAME}}</w:t>
       </w:r>
       <w:r>
         <w:rPr>
@@ -553,16 +543,16 @@
           <w:szCs w:val="26"/>
           <w:rtl w:val="0"/>
         </w:rPr>
-        <w:t xml:space="preserve">{{ASSOCIATION}}</w:t>
-      </w:r>
-      <w:r>
-        <w:rPr>
-          <w:rFonts w:ascii="Nirmala UI" w:cs="Nirmala UI" w:eastAsia="Nirmala UI" w:hAnsi="Nirmala UI"/>
-          <w:sz w:val="26"/>
-          <w:szCs w:val="26"/>
-          <w:rtl w:val="0"/>
-        </w:rPr>
-        <w:t xml:space="preserve">” का “{{DESIGNATION}}” मनोनीत किया है |</w:t>
+        <w:t xml:space="preserve">{{ASSOCIATION_NAME}}</w:t>
+      </w:r>
+      <w:r>
+        <w:rPr>
+          <w:rFonts w:ascii="Nirmala UI" w:cs="Nirmala UI" w:eastAsia="Nirmala UI" w:hAnsi="Nirmala UI"/>
+          <w:sz w:val="26"/>
+          <w:szCs w:val="26"/>
+          <w:rtl w:val="0"/>
+        </w:rPr>
+        <w:t xml:space="preserve">” का “कार्यकारिणी कोषाध्यक्ष” मनोनीत किया है |</w:t>
       </w:r>
       <w:r>
         <w:rPr>
@@ -630,7 +620,27 @@
           <w:szCs w:val="26"/>
           <w:rtl w:val="0"/>
         </w:rPr>
-        <w:t xml:space="preserve">यह कि मध्यप्रदेश भूखंड स्वमित्व अधिनियम 2000 की धारा 18 के अंतर्गत श्रीमान सक्षम प्राधिकारी श्रीमान अनुविभागीय अधिकारी महोदय {{AUTHORITY_LOCATION}} के कार्यालय में पंजीयन हेतु आवेदन प्रस्तुत किया जा रहा है, जिसके समर्थन में मेरे द्वारा यह शपथ पत्र प्रस्तुत किया जा रहा है |</w:t>
+        <w:t xml:space="preserve">यह कि मध्यप्रदेश भूखंड स्वमित्व अधिनियम 2000 की धारा 18 के अंतर्गत श्रीमान सक्षम प्राधिकारी श्रीमान अनुविभागीय अधिकारी महोदय </w:t>
+      </w:r>
+      <w:r>
+        <w:rPr>
+          <w:rFonts w:ascii="Nirmala UI" w:cs="Nirmala UI" w:eastAsia="Nirmala UI" w:hAnsi="Nirmala UI"/>
+          <w:b w:val="1"/>
+          <w:bCs w:val="1"/>
+          <w:sz w:val="26"/>
+          <w:szCs w:val="26"/>
+          <w:rtl w:val="0"/>
+        </w:rPr>
+        <w:t xml:space="preserve">{{AUTHORITY_LOCATION}}</w:t>
+      </w:r>
+      <w:r>
+        <w:rPr>
+          <w:rFonts w:ascii="Nirmala UI" w:cs="Nirmala UI" w:eastAsia="Nirmala UI" w:hAnsi="Nirmala UI"/>
+          <w:sz w:val="26"/>
+          <w:szCs w:val="26"/>
+          <w:rtl w:val="0"/>
+        </w:rPr>
+        <w:t xml:space="preserve"> के कार्यालय में पंजीयन हेतु आवेदन प्रस्तुत किया जा रहा है, जिसके समर्थन में मेरे द्वारा यह शपथ पत्र प्रस्तुत किया जा रहा है |</w:t>
       </w:r>
       <w:r>
         <w:rPr>
@@ -695,27 +705,32 @@
           <w:szCs w:val="26"/>
           <w:rtl w:val="0"/>
         </w:rPr>
-        <w:t xml:space="preserve"> मनोनीत {{DESIGNATION}}, “</w:t>
-      </w:r>
-      <w:r>
-        <w:rPr>
-          <w:rFonts w:ascii="Nirmala UI" w:cs="Nirmala UI" w:eastAsia="Nirmala UI" w:hAnsi="Nirmala UI"/>
-          <w:b w:val="1"/>
-          <w:bCs w:val="1"/>
-          <w:sz w:val="26"/>
-          <w:szCs w:val="26"/>
-          <w:rtl w:val="0"/>
-        </w:rPr>
-        <w:t xml:space="preserve">{{ASSOCIATION}}</w:t>
-      </w:r>
-      <w:r>
-        <w:rPr>
-          <w:rFonts w:ascii="Nirmala UI" w:cs="Nirmala UI" w:eastAsia="Nirmala UI" w:hAnsi="Nirmala UI"/>
-          <w:sz w:val="26"/>
-          <w:szCs w:val="26"/>
-          <w:rtl w:val="0"/>
-        </w:rPr>
-        <w:t xml:space="preserve">”मध्यप्रदेश प्रकोष्ठ स्वामित्व अधिनियम के सभी नियमों का पूर्ण रूप से पालन करूँगा |</w:t>
+        <w:t xml:space="preserve"> मनोनीत कार्यकारिणी कोषाध्यक्ष, “</w:t>
+      </w:r>
+      <w:r>
+        <w:rPr>
+          <w:rFonts w:ascii="Nirmala UI" w:cs="Nirmala UI" w:eastAsia="Nirmala UI" w:hAnsi="Nirmala UI"/>
+          <w:b w:val="1"/>
+          <w:bCs w:val="1"/>
+          <w:sz w:val="26"/>
+          <w:szCs w:val="26"/>
+          <w:rtl w:val="0"/>
+        </w:rPr>
+        <w:t xml:space="preserve">{{ASSOCIATION_NAME}}</w:t>
+      </w:r>
+      <w:r>
+        <w:rPr>
+          <w:rFonts w:ascii="Nirmala UI" w:cs="Nirmala UI" w:eastAsia="Nirmala UI" w:hAnsi="Nirmala UI"/>
+          <w:sz w:val="26"/>
+          <w:szCs w:val="26"/>
+          <w:rtl w:val="0"/>
+        </w:rPr>
+        <w:t xml:space="preserve">” मध्यप्रदेश प्रकोष्ठ स्वामित्व अधिनियम के सभी नियमों का पूर्ण रूप से पालन करूँगा |</w:t>
+      </w:r>
+      <w:r>
+        <w:rPr>
+          <w:rtl w:val="0"/>
+        </w:rPr>
       </w:r>
     </w:p>
     <w:p>
@@ -770,7 +785,7 @@
           <w:szCs w:val="26"/>
           <w:rtl w:val="0"/>
         </w:rPr>
-        <w:t xml:space="preserve">{{ASSOCIATION}}</w:t>
+        <w:t xml:space="preserve">{{ASSOCIATION_NAME}}</w:t>
       </w:r>
       <w:r>
         <w:rPr>
@@ -781,19 +796,39 @@
         </w:rPr>
         <w:t xml:space="preserve"> ” का पंजीयन किये जाने बाबद उपरोक्त समस्त कथन में दिया हैं | सो सही ताकि प्रमाण रहे |</w:t>
       </w:r>
-      <w:r>
-        <w:rPr>
-          <w:rtl w:val="0"/>
-        </w:rPr>
-      </w:r>
-    </w:p>
-    <w:p>
-      <w:pPr>
+    </w:p>
+    <w:p>
+      <w:pPr>
+        <w:tabs>
+          <w:tab w:val="left" w:leader="none" w:pos="720"/>
+        </w:tabs>
         <w:spacing w:after="0" w:line="276" w:lineRule="auto"/>
-        <w:ind w:right="90" w:firstLine="720"/>
-        <w:jc w:val="both"/>
-        <w:rPr>
-          <w:rFonts w:ascii="Kruti Dev 010" w:cs="Kruti Dev 010" w:eastAsia="Kruti Dev 010" w:hAnsi="Kruti Dev 010"/>
+        <w:ind w:left="1080" w:right="90" w:firstLine="0"/>
+        <w:jc w:val="both"/>
+        <w:rPr>
+          <w:rFonts w:ascii="Nirmala UI" w:cs="Nirmala UI" w:eastAsia="Nirmala UI" w:hAnsi="Nirmala UI"/>
+          <w:sz w:val="26"/>
+          <w:szCs w:val="26"/>
+        </w:rPr>
+      </w:pPr>
+      <w:r>
+        <w:rPr>
+          <w:rtl w:val="0"/>
+        </w:rPr>
+      </w:r>
+    </w:p>
+    <w:p>
+      <w:pPr>
+        <w:tabs>
+          <w:tab w:val="left" w:leader="none" w:pos="720"/>
+        </w:tabs>
+        <w:spacing w:after="0" w:line="276" w:lineRule="auto"/>
+        <w:ind w:left="1080" w:right="90" w:firstLine="0"/>
+        <w:jc w:val="both"/>
+        <w:rPr>
+          <w:rFonts w:ascii="Nirmala UI" w:cs="Nirmala UI" w:eastAsia="Nirmala UI" w:hAnsi="Nirmala UI"/>
+          <w:sz w:val="26"/>
+          <w:szCs w:val="26"/>
         </w:rPr>
       </w:pPr>
       <w:r>
@@ -808,40 +843,6 @@
         <w:ind w:left="360" w:right="90" w:firstLine="360"/>
         <w:jc w:val="both"/>
         <w:rPr>
-          <w:rFonts w:ascii="Kruti Dev 010" w:cs="Kruti Dev 010" w:eastAsia="Kruti Dev 010" w:hAnsi="Kruti Dev 010"/>
-        </w:rPr>
-      </w:pPr>
-      <w:r>
-        <w:rPr>
-          <w:rFonts w:ascii="Nirmala UI" w:cs="Nirmala UI" w:eastAsia="Nirmala UI" w:hAnsi="Nirmala UI"/>
-          <w:sz w:val="26"/>
-          <w:szCs w:val="26"/>
-          <w:rtl w:val="0"/>
-        </w:rPr>
-        <w:t xml:space="preserve">           </w:t>
-        <w:tab/>
-        <w:tab/>
-        <w:tab/>
-        <w:tab/>
-        <w:tab/>
-        <w:tab/>
-        <w:tab/>
-        <w:tab/>
-        <w:t xml:space="preserve"> </w:t>
-        <w:tab/>
-      </w:r>
-      <w:r>
-        <w:rPr>
-          <w:rtl w:val="0"/>
-        </w:rPr>
-      </w:r>
-    </w:p>
-    <w:p>
-      <w:pPr>
-        <w:spacing w:after="200" w:line="240" w:lineRule="auto"/>
-        <w:ind w:left="360" w:right="90" w:firstLine="360"/>
-        <w:jc w:val="both"/>
-        <w:rPr>
           <w:rFonts w:ascii="Mangal" w:cs="Mangal" w:eastAsia="Mangal" w:hAnsi="Mangal"/>
         </w:rPr>
       </w:pPr>
@@ -854,7 +855,7 @@
           <w:szCs w:val="26"/>
           <w:rtl w:val="0"/>
         </w:rPr>
-        <w:t xml:space="preserve">दिनांक {{DATE}}</w:t>
+        <w:t xml:space="preserve">दिनांक _________</w:t>
         <w:tab/>
         <w:t xml:space="preserve">                                                                             {{NAME}}</w:t>
       </w:r>
@@ -866,7 +867,7 @@
     </w:p>
     <w:p>
       <w:pPr>
-        <w:spacing w:after="200" w:line="240" w:lineRule="auto"/>
+        <w:spacing w:after="0" w:line="240" w:lineRule="auto"/>
         <w:ind w:left="720" w:right="90" w:firstLine="0"/>
         <w:jc w:val="both"/>
         <w:rPr>
@@ -923,7 +924,7 @@
           <w:szCs w:val="26"/>
           <w:rtl w:val="0"/>
         </w:rPr>
-        <w:t xml:space="preserve">मनोनीत {{DESIGNATION}}</w:t>
+        <w:t xml:space="preserve">मनोनीत कार्यकारिणी कोषाध्यक्ष</w:t>
       </w:r>
       <w:r>
         <w:rPr>
@@ -935,7 +936,7 @@
       <w:pPr>
         <w:pageBreakBefore w:val="1"/>
         <w:spacing w:after="200" w:line="276" w:lineRule="auto"/>
-        <w:ind w:left="4320" w:right="90" w:firstLine="0"/>
+        <w:ind w:left="3600" w:right="90" w:firstLine="720"/>
         <w:jc w:val="left"/>
         <w:rPr>
           <w:rFonts w:ascii="Nirmala UI" w:cs="Nirmala UI" w:eastAsia="Nirmala UI" w:hAnsi="Nirmala UI"/>
@@ -955,8 +956,8 @@
     <w:p>
       <w:pPr>
         <w:spacing w:after="200" w:line="276" w:lineRule="auto"/>
-        <w:ind w:left="3600" w:right="90" w:firstLine="720"/>
-        <w:jc w:val="left"/>
+        <w:ind w:left="720" w:right="90" w:firstLine="0"/>
+        <w:jc w:val="center"/>
         <w:rPr>
           <w:rFonts w:ascii="Nirmala UI" w:cs="Nirmala UI" w:eastAsia="Nirmala UI" w:hAnsi="Nirmala UI"/>
           <w:b w:val="1"/>
@@ -1016,7 +1017,7 @@
           <w:szCs w:val="26"/>
           <w:rtl w:val="0"/>
         </w:rPr>
-        <w:t xml:space="preserve">मैं शपथपूर्वक उपरोक्त कथन सत्यापित करता/ करती हूँ कि उपरोक्त शपथ पत्र का समस्त कथन मेरी निजी जानकारी एवं विश्वास से सत्य एवं सही है, इसमें कुछ भी असत्य कथन नही किया गया होकर किसी भी तथ्यगत बात को छुपाया नहीं गया है| आज दिनांक {{DATE}}को जिला {{CITY}} में मेने इस पर अपने हस्ताक्षर करके इसे सत्यापित किय है|</w:t>
+        <w:t xml:space="preserve">मैं शपथपूर्वक उपरोक्त कथन सत्यापित करता/ करती हूँ कि उपरोक्त शपथ पत्र का समस्त कथन मेरी निजी जानकारी एवं विश्वास से सत्य एवं सही है, इसमें कुछ भी असत्य कथन नही किया गया होकर किसी भी तथ्यगत बात को छुपाया नहीं गया है| आज दिनांक _________को जिला {{CITY}} में मेने इस पर अपने हस्ताक्षर करके इसे सत्यापित किय है|</w:t>
       </w:r>
       <w:r>
         <w:rPr>
@@ -1073,7 +1074,7 @@
           <w:szCs w:val="26"/>
           <w:rtl w:val="0"/>
         </w:rPr>
-        <w:t xml:space="preserve">दिनांक: {{DATE}}</w:t>
+        <w:t xml:space="preserve">दिनांक: _________</w:t>
       </w:r>
       <w:r>
         <w:rPr>
@@ -1122,7 +1123,7 @@
           <w:szCs w:val="26"/>
           <w:rtl w:val="0"/>
         </w:rPr>
-        <w:t xml:space="preserve">                                                                        {{DESIGNATION}}</w:t>
+        <w:t xml:space="preserve">                                                                        कार्यकारिणी कोषाध्यक्ष</w:t>
       </w:r>
       <w:r>
         <w:rPr>
@@ -1150,7 +1151,7 @@
           <w:rtl w:val="0"/>
         </w:rPr>
         <w:tab/>
-        <w:t xml:space="preserve">{{ASSOCIATION}}</w:t>
+        <w:t xml:space="preserve">{{ASSOCIATION_NAME}}</w:t>
       </w:r>
       <w:r>
         <w:rPr>
@@ -1402,6 +1403,20 @@
       <w:sz w:val="56"/>
       <w:szCs w:val="56"/>
     </w:rPr>
+  </w:style>
+  <w:style w:type="table" w:styleId="TableNormal" w:default="1">
+    <w:name w:val="TableNormal"/>
+    <w:tblPr>
+      <w:tblCellMar>
+        <w:top w:w="100.0" w:type="dxa"/>
+        <w:left w:w="100.0" w:type="dxa"/>
+        <w:bottom w:w="100.0" w:type="dxa"/>
+        <w:right w:w="100.0" w:type="dxa"/>
+      </w:tblCellMar>
+    </w:tblPr>
+  </w:style>
+  <w:style w:type="paragraph" w:styleId="Normal" w:default="1">
+    <w:name w:val="normal"/>
   </w:style>
   <w:style w:type="table" w:styleId="TableNormal" w:default="1">
     <w:name w:val="TableNormal"/>
@@ -2083,7 +2098,7 @@
 
 <file path=customXML/item1.xml><?xml version="1.0" encoding="utf-8"?>
 <go:gDocsCustomXmlDataStorage xmlns:go="http://customooxmlschemas.google.com/" xmlns:r="http://schemas.openxmlformats.org/officeDocument/2006/relationships" uri="GoogleDocsCustomDataVersion2">
-  <go:docsCustomData xmlns:go="http://customooxmlschemas.google.com/" roundtripDataSignature="AMtx7mirVBUSbk+Tn7StgTkkajH0/TM9iQ==">CgMxLjAyDmguajhkanAyYzBuanVqMg5oLnFmNzBpcGJibzIwMDIOaC40NWE5bXQ2a29oenYyDmgubngzNzlkdmc5aGF5Mg5oLjN3MzB3ZGx0eTlpbzgAciExckQxVHNxZVZ1TlBWcGM4UEZ5XzJ5VEJlbkpqelY2ZGo=</go:docsCustomData>
+  <go:docsCustomData xmlns:go="http://customooxmlschemas.google.com/" roundtripDataSignature="AMtx7mi9Ija8b3CW0BqtheUoT8CTh9Z3Yw==">CgMxLjAyDmguajhkanAyYzBuanVqMg5oLnFmNzBpcGJibzIwMDIOaC40NWE5bXQ2a29oenYyDmgubngzNzlkdmc5aGF5Mg5oLjN3MzB3ZGx0eTlpbzgAciExODhyRFNyblVnMkZId3oyRjg2eWRfOUlXT0dVd3lZQjM=</go:docsCustomData>
 </go:gDocsCustomXmlDataStorage>
 </file>
 

</xml_diff>

<commit_message>
web implimentation of all 6 docs template is completed
</commit_message>
<xml_diff>
--- a/templates/Affidavit_Template.docx
+++ b/templates/Affidavit_Template.docx
@@ -11,6 +11,8 @@
           <w:rFonts w:ascii="Nirmala UI" w:cs="Nirmala UI" w:eastAsia="Nirmala UI" w:hAnsi="Nirmala UI"/>
           <w:b w:val="1"/>
           <w:bCs w:val="1"/>
+          <w:sz w:val="22"/>
+          <w:szCs w:val="22"/>
           <w:u w:val="single"/>
         </w:rPr>
       </w:pPr>
@@ -20,6 +22,35 @@
         <w:rPr>
           <w:rtl w:val="0"/>
         </w:rPr>
+      </w:r>
+    </w:p>
+    <w:p>
+      <w:pPr>
+        <w:spacing w:after="160" w:line="240" w:lineRule="auto"/>
+        <w:ind w:left="-1276" w:right="90" w:firstLine="1276"/>
+        <w:jc w:val="center"/>
+        <w:rPr>
+          <w:rFonts w:ascii="Nirmala UI" w:cs="Nirmala UI" w:eastAsia="Nirmala UI" w:hAnsi="Nirmala UI"/>
+          <w:b w:val="1"/>
+          <w:bCs w:val="1"/>
+          <w:sz w:val="28"/>
+          <w:szCs w:val="28"/>
+          <w:u w:val="single"/>
+        </w:rPr>
+      </w:pPr>
+      <w:bookmarkStart w:colFirst="0" w:colLast="0" w:name="_heading=h.nx379dvg9hay" w:id="1"/>
+      <w:bookmarkEnd w:id="1"/>
+      <w:r>
+        <w:rPr>
+          <w:rFonts w:ascii="Nirmala UI" w:cs="Nirmala UI" w:eastAsia="Nirmala UI" w:hAnsi="Nirmala UI"/>
+          <w:b w:val="1"/>
+          <w:bCs w:val="1"/>
+          <w:sz w:val="28"/>
+          <w:szCs w:val="28"/>
+          <w:u w:val="single"/>
+          <w:rtl w:val="0"/>
+        </w:rPr>
+        <w:t xml:space="preserve">शपथ पत्र</w:t>
       </w:r>
     </w:p>
     <w:p>
@@ -31,11 +62,13 @@
           <w:rFonts w:ascii="Nirmala UI" w:cs="Nirmala UI" w:eastAsia="Nirmala UI" w:hAnsi="Nirmala UI"/>
           <w:b w:val="1"/>
           <w:bCs w:val="1"/>
+          <w:sz w:val="22"/>
+          <w:szCs w:val="22"/>
           <w:u w:val="single"/>
         </w:rPr>
       </w:pPr>
-      <w:bookmarkStart w:colFirst="0" w:colLast="0" w:name="_heading=h.qf70ipbbo200" w:id="1"/>
-      <w:bookmarkEnd w:id="1"/>
+      <w:bookmarkStart w:colFirst="0" w:colLast="0" w:name="_heading=h.3w30wdlty9io" w:id="2"/>
+      <w:bookmarkEnd w:id="2"/>
       <w:r>
         <w:rPr>
           <w:rtl w:val="0"/>
@@ -45,66 +78,25 @@
     <w:p>
       <w:pPr>
         <w:spacing w:after="0" w:line="240" w:lineRule="auto"/>
-        <w:ind w:left="-1276" w:right="90" w:firstLine="1276"/>
-        <w:jc w:val="center"/>
-        <w:rPr>
-          <w:rFonts w:ascii="Nirmala UI" w:cs="Nirmala UI" w:eastAsia="Nirmala UI" w:hAnsi="Nirmala UI"/>
-          <w:b w:val="1"/>
-          <w:bCs w:val="1"/>
-          <w:u w:val="single"/>
-        </w:rPr>
-      </w:pPr>
-      <w:bookmarkStart w:colFirst="0" w:colLast="0" w:name="_heading=h.45a9mt6kohzv" w:id="2"/>
-      <w:bookmarkEnd w:id="2"/>
-      <w:r>
-        <w:rPr>
-          <w:rtl w:val="0"/>
-        </w:rPr>
-      </w:r>
-    </w:p>
-    <w:p>
-      <w:pPr>
-        <w:spacing w:after="160" w:line="240" w:lineRule="auto"/>
-        <w:ind w:left="-1276" w:right="90" w:firstLine="1276"/>
-        <w:jc w:val="center"/>
-        <w:rPr>
-          <w:rFonts w:ascii="Nirmala UI" w:cs="Nirmala UI" w:eastAsia="Nirmala UI" w:hAnsi="Nirmala UI"/>
-          <w:b w:val="1"/>
-          <w:bCs w:val="1"/>
-          <w:sz w:val="36"/>
-          <w:szCs w:val="36"/>
-          <w:u w:val="single"/>
-        </w:rPr>
-      </w:pPr>
-      <w:bookmarkStart w:colFirst="0" w:colLast="0" w:name="_heading=h.nx379dvg9hay" w:id="3"/>
-      <w:bookmarkEnd w:id="3"/>
-      <w:r>
-        <w:rPr>
-          <w:rFonts w:ascii="Nirmala UI" w:cs="Nirmala UI" w:eastAsia="Nirmala UI" w:hAnsi="Nirmala UI"/>
-          <w:b w:val="1"/>
-          <w:bCs w:val="1"/>
-          <w:sz w:val="36"/>
-          <w:szCs w:val="36"/>
-          <w:u w:val="single"/>
-          <w:rtl w:val="0"/>
-        </w:rPr>
-        <w:t xml:space="preserve">शपथ पत्र</w:t>
-      </w:r>
-    </w:p>
-    <w:p>
-      <w:pPr>
-        <w:spacing w:after="0" w:line="240" w:lineRule="auto"/>
-        <w:ind w:left="-1276" w:right="90" w:firstLine="1276"/>
-        <w:jc w:val="center"/>
-        <w:rPr>
-          <w:rFonts w:ascii="Nirmala UI" w:cs="Nirmala UI" w:eastAsia="Nirmala UI" w:hAnsi="Nirmala UI"/>
-          <w:b w:val="1"/>
-          <w:bCs w:val="1"/>
-          <w:u w:val="single"/>
-        </w:rPr>
-      </w:pPr>
-      <w:bookmarkStart w:colFirst="0" w:colLast="0" w:name="_heading=h.3w30wdlty9io" w:id="4"/>
-      <w:bookmarkEnd w:id="4"/>
+        <w:ind w:left="720" w:right="90" w:firstLine="0"/>
+        <w:jc w:val="both"/>
+        <w:rPr>
+          <w:rFonts w:ascii="Kruti Dev 010" w:cs="Kruti Dev 010" w:eastAsia="Kruti Dev 010" w:hAnsi="Kruti Dev 010"/>
+          <w:b w:val="1"/>
+          <w:bCs w:val="1"/>
+          <w:sz w:val="22"/>
+          <w:szCs w:val="22"/>
+        </w:rPr>
+      </w:pPr>
+      <w:r>
+        <w:rPr>
+          <w:rFonts w:ascii="Nirmala UI" w:cs="Nirmala UI" w:eastAsia="Nirmala UI" w:hAnsi="Nirmala UI"/>
+          <w:sz w:val="22"/>
+          <w:szCs w:val="22"/>
+          <w:rtl w:val="0"/>
+        </w:rPr>
+        <w:t xml:space="preserve">मैं शपथपूर्वक कथन करता/ करती हूँ कि:-</w:t>
+      </w:r>
       <w:r>
         <w:rPr>
           <w:rtl w:val="0"/>
@@ -120,17 +112,10 @@
           <w:rFonts w:ascii="Kruti Dev 010" w:cs="Kruti Dev 010" w:eastAsia="Kruti Dev 010" w:hAnsi="Kruti Dev 010"/>
           <w:b w:val="1"/>
           <w:bCs w:val="1"/>
-        </w:rPr>
-      </w:pPr>
-      <w:r>
-        <w:rPr>
-          <w:rFonts w:ascii="Nirmala UI" w:cs="Nirmala UI" w:eastAsia="Nirmala UI" w:hAnsi="Nirmala UI"/>
-          <w:sz w:val="26"/>
-          <w:szCs w:val="26"/>
-          <w:rtl w:val="0"/>
-        </w:rPr>
-        <w:t xml:space="preserve">           मैं शपथपूर्वक कथन करता/ करती हूँ कि:-</w:t>
-      </w:r>
+          <w:sz w:val="22"/>
+          <w:szCs w:val="22"/>
+        </w:rPr>
+      </w:pPr>
       <w:r>
         <w:rPr>
           <w:rtl w:val="0"/>
@@ -140,41 +125,24 @@
     <w:p>
       <w:pPr>
         <w:spacing w:after="0" w:line="240" w:lineRule="auto"/>
-        <w:ind w:right="90"/>
+        <w:ind w:right="90" w:firstLine="720"/>
         <w:jc w:val="both"/>
         <w:rPr>
           <w:rFonts w:ascii="Kruti Dev 010" w:cs="Kruti Dev 010" w:eastAsia="Kruti Dev 010" w:hAnsi="Kruti Dev 010"/>
           <w:b w:val="1"/>
           <w:bCs w:val="1"/>
-        </w:rPr>
-      </w:pPr>
-      <w:r>
-        <w:rPr>
-          <w:rtl w:val="0"/>
-        </w:rPr>
-      </w:r>
-    </w:p>
-    <w:p>
-      <w:pPr>
-        <w:spacing w:after="0" w:line="240" w:lineRule="auto"/>
-        <w:ind w:right="90"/>
-        <w:jc w:val="both"/>
-        <w:rPr>
-          <w:rFonts w:ascii="Kruti Dev 010" w:cs="Kruti Dev 010" w:eastAsia="Kruti Dev 010" w:hAnsi="Kruti Dev 010"/>
-          <w:b w:val="1"/>
-          <w:bCs w:val="1"/>
-        </w:rPr>
-      </w:pPr>
-      <w:r>
-        <w:rPr>
-          <w:rFonts w:ascii="Nirmala UI" w:cs="Nirmala UI" w:eastAsia="Nirmala UI" w:hAnsi="Nirmala UI"/>
-          <w:sz w:val="26"/>
-          <w:szCs w:val="26"/>
-          <w:rtl w:val="0"/>
-        </w:rPr>
-        <w:t xml:space="preserve">            मेरा नाम</w:t>
-        <w:tab/>
-        <w:tab/>
+          <w:sz w:val="22"/>
+          <w:szCs w:val="22"/>
+        </w:rPr>
+      </w:pPr>
+      <w:r>
+        <w:rPr>
+          <w:rFonts w:ascii="Nirmala UI" w:cs="Nirmala UI" w:eastAsia="Nirmala UI" w:hAnsi="Nirmala UI"/>
+          <w:sz w:val="22"/>
+          <w:szCs w:val="22"/>
+          <w:rtl w:val="0"/>
+        </w:rPr>
+        <w:t xml:space="preserve">  मेरा नाम</w:t>
         <w:tab/>
         <w:t xml:space="preserve">: {{NAME}}</w:t>
       </w:r>
@@ -193,19 +161,19 @@
           <w:rFonts w:ascii="Kruti Dev 010" w:cs="Kruti Dev 010" w:eastAsia="Kruti Dev 010" w:hAnsi="Kruti Dev 010"/>
           <w:b w:val="1"/>
           <w:bCs w:val="1"/>
-        </w:rPr>
-      </w:pPr>
-      <w:r>
-        <w:rPr>
-          <w:rFonts w:ascii="Nirmala UI" w:cs="Nirmala UI" w:eastAsia="Nirmala UI" w:hAnsi="Nirmala UI"/>
-          <w:sz w:val="26"/>
-          <w:szCs w:val="26"/>
+          <w:sz w:val="22"/>
+          <w:szCs w:val="22"/>
+        </w:rPr>
+      </w:pPr>
+      <w:r>
+        <w:rPr>
+          <w:rFonts w:ascii="Nirmala UI" w:cs="Nirmala UI" w:eastAsia="Nirmala UI" w:hAnsi="Nirmala UI"/>
+          <w:sz w:val="22"/>
+          <w:szCs w:val="22"/>
           <w:rtl w:val="0"/>
         </w:rPr>
         <w:t xml:space="preserve">  पिता का नाम</w:t>
         <w:tab/>
-        <w:tab/>
-        <w:tab/>
         <w:t xml:space="preserve">: {{FATHER}}</w:t>
       </w:r>
       <w:r>
@@ -223,21 +191,49 @@
           <w:rFonts w:ascii="Kruti Dev 010" w:cs="Kruti Dev 010" w:eastAsia="Kruti Dev 010" w:hAnsi="Kruti Dev 010"/>
           <w:b w:val="1"/>
           <w:bCs w:val="1"/>
-        </w:rPr>
-      </w:pPr>
-      <w:r>
-        <w:rPr>
-          <w:rFonts w:ascii="Nirmala UI" w:cs="Nirmala UI" w:eastAsia="Nirmala UI" w:hAnsi="Nirmala UI"/>
-          <w:sz w:val="26"/>
-          <w:szCs w:val="26"/>
+          <w:sz w:val="22"/>
+          <w:szCs w:val="22"/>
+        </w:rPr>
+      </w:pPr>
+      <w:r>
+        <w:rPr>
+          <w:rFonts w:ascii="Nirmala UI" w:cs="Nirmala UI" w:eastAsia="Nirmala UI" w:hAnsi="Nirmala UI"/>
+          <w:sz w:val="22"/>
+          <w:szCs w:val="22"/>
           <w:rtl w:val="0"/>
         </w:rPr>
         <w:t xml:space="preserve">  उम्र</w:t>
         <w:tab/>
         <w:tab/>
-        <w:tab/>
-        <w:tab/>
         <w:t xml:space="preserve">: {{AGE}} वर्ष</w:t>
+      </w:r>
+      <w:r>
+        <w:rPr>
+          <w:rtl w:val="0"/>
+        </w:rPr>
+      </w:r>
+    </w:p>
+    <w:p>
+      <w:pPr>
+        <w:spacing w:after="0" w:line="276" w:lineRule="auto"/>
+        <w:ind w:left="810" w:right="90" w:firstLine="15"/>
+        <w:jc w:val="both"/>
+        <w:rPr>
+          <w:rFonts w:ascii="Kruti Dev 010" w:cs="Kruti Dev 010" w:eastAsia="Kruti Dev 010" w:hAnsi="Kruti Dev 010"/>
+          <w:b w:val="1"/>
+          <w:bCs w:val="1"/>
+          <w:sz w:val="22"/>
+          <w:szCs w:val="22"/>
+        </w:rPr>
+      </w:pPr>
+      <w:r>
+        <w:rPr>
+          <w:rFonts w:ascii="Nirmala UI" w:cs="Nirmala UI" w:eastAsia="Nirmala UI" w:hAnsi="Nirmala UI"/>
+          <w:sz w:val="22"/>
+          <w:szCs w:val="22"/>
+          <w:rtl w:val="0"/>
+        </w:rPr>
+        <w:t xml:space="preserve">निवास             : {{ADDRESS}}</w:t>
       </w:r>
       <w:r>
         <w:rPr>
@@ -252,34 +248,8 @@
         <w:jc w:val="both"/>
         <w:rPr>
           <w:rFonts w:ascii="Kruti Dev 010" w:cs="Kruti Dev 010" w:eastAsia="Kruti Dev 010" w:hAnsi="Kruti Dev 010"/>
-          <w:b w:val="1"/>
-          <w:bCs w:val="1"/>
-        </w:rPr>
-      </w:pPr>
-      <w:r>
-        <w:rPr>
-          <w:rFonts w:ascii="Nirmala UI" w:cs="Nirmala UI" w:eastAsia="Nirmala UI" w:hAnsi="Nirmala UI"/>
-          <w:sz w:val="26"/>
-          <w:szCs w:val="26"/>
-          <w:rtl w:val="0"/>
-        </w:rPr>
-        <w:t xml:space="preserve">  निवास                             </w:t>
-        <w:tab/>
-        <w:t xml:space="preserve">: {{ADDRESS}}</w:t>
-      </w:r>
-      <w:r>
-        <w:rPr>
-          <w:rtl w:val="0"/>
-        </w:rPr>
-      </w:r>
-    </w:p>
-    <w:p>
-      <w:pPr>
-        <w:spacing w:after="0" w:line="276" w:lineRule="auto"/>
-        <w:ind w:left="709" w:right="90" w:firstLine="10.999999999999943"/>
-        <w:jc w:val="both"/>
-        <w:rPr>
-          <w:rFonts w:ascii="Kruti Dev 010" w:cs="Kruti Dev 010" w:eastAsia="Kruti Dev 010" w:hAnsi="Kruti Dev 010"/>
+          <w:sz w:val="22"/>
+          <w:szCs w:val="22"/>
         </w:rPr>
       </w:pPr>
       <w:r>
@@ -297,13 +267,16 @@
         <w:spacing w:after="0" w:line="276" w:lineRule="auto"/>
         <w:ind w:left="1080" w:right="90" w:hanging="360"/>
         <w:jc w:val="both"/>
-        <w:rPr/>
-      </w:pPr>
-      <w:r>
-        <w:rPr>
-          <w:rFonts w:ascii="Nirmala UI" w:cs="Nirmala UI" w:eastAsia="Nirmala UI" w:hAnsi="Nirmala UI"/>
-          <w:sz w:val="26"/>
-          <w:szCs w:val="26"/>
+        <w:rPr>
+          <w:sz w:val="22"/>
+          <w:szCs w:val="22"/>
+        </w:rPr>
+      </w:pPr>
+      <w:r>
+        <w:rPr>
+          <w:rFonts w:ascii="Nirmala UI" w:cs="Nirmala UI" w:eastAsia="Nirmala UI" w:hAnsi="Nirmala UI"/>
+          <w:sz w:val="22"/>
+          <w:szCs w:val="22"/>
           <w:rtl w:val="0"/>
         </w:rPr>
         <w:t xml:space="preserve">यह कि, हमारे द्वारा परियोजना “</w:t>
@@ -314,8 +287,8 @@
           <w:b w:val="1"/>
           <w:bCs w:val="1"/>
           <w:color w:val="000000"/>
-          <w:sz w:val="26"/>
-          <w:szCs w:val="26"/>
+          <w:sz w:val="22"/>
+          <w:szCs w:val="22"/>
           <w:rtl w:val="0"/>
         </w:rPr>
         <w:t xml:space="preserve">{{PROJECT}}</w:t>
@@ -323,8 +296,8 @@
       <w:r>
         <w:rPr>
           <w:rFonts w:ascii="Nirmala UI" w:cs="Nirmala UI" w:eastAsia="Nirmala UI" w:hAnsi="Nirmala UI"/>
-          <w:sz w:val="26"/>
-          <w:szCs w:val="26"/>
+          <w:sz w:val="22"/>
+          <w:szCs w:val="22"/>
           <w:rtl w:val="0"/>
         </w:rPr>
         <w:t xml:space="preserve"> जो की </w:t>
@@ -334,8 +307,8 @@
           <w:rFonts w:ascii="Nirmala UI" w:cs="Nirmala UI" w:eastAsia="Nirmala UI" w:hAnsi="Nirmala UI"/>
           <w:b w:val="1"/>
           <w:bCs w:val="1"/>
-          <w:sz w:val="26"/>
-          <w:szCs w:val="26"/>
+          <w:sz w:val="22"/>
+          <w:szCs w:val="22"/>
           <w:rtl w:val="0"/>
         </w:rPr>
         <w:t xml:space="preserve">{{association_address}}</w:t>
@@ -343,8 +316,8 @@
       <w:r>
         <w:rPr>
           <w:rFonts w:ascii="Nirmala UI" w:cs="Nirmala UI" w:eastAsia="Nirmala UI" w:hAnsi="Nirmala UI"/>
-          <w:sz w:val="26"/>
-          <w:szCs w:val="26"/>
+          <w:sz w:val="22"/>
+          <w:szCs w:val="22"/>
           <w:rtl w:val="0"/>
         </w:rPr>
         <w:t xml:space="preserve"> विकसित की गई है, जिसका रेरा पंजीयन क्रमांक </w:t>
@@ -354,8 +327,8 @@
           <w:rFonts w:ascii="Nirmala UI" w:cs="Nirmala UI" w:eastAsia="Nirmala UI" w:hAnsi="Nirmala UI"/>
           <w:b w:val="1"/>
           <w:bCs w:val="1"/>
-          <w:sz w:val="26"/>
-          <w:szCs w:val="26"/>
+          <w:sz w:val="22"/>
+          <w:szCs w:val="22"/>
           <w:rtl w:val="0"/>
         </w:rPr>
         <w:t xml:space="preserve">{{RERA}} </w:t>
@@ -363,8 +336,8 @@
       <w:r>
         <w:rPr>
           <w:rFonts w:ascii="Nirmala UI" w:cs="Nirmala UI" w:eastAsia="Nirmala UI" w:hAnsi="Nirmala UI"/>
-          <w:sz w:val="26"/>
-          <w:szCs w:val="26"/>
+          <w:sz w:val="22"/>
+          <w:szCs w:val="22"/>
           <w:rtl w:val="0"/>
         </w:rPr>
         <w:t xml:space="preserve">यह की विकासकर्ता </w:t>
@@ -374,8 +347,8 @@
           <w:rFonts w:ascii="Nirmala UI" w:cs="Nirmala UI" w:eastAsia="Nirmala UI" w:hAnsi="Nirmala UI"/>
           <w:b w:val="1"/>
           <w:bCs w:val="1"/>
-          <w:sz w:val="26"/>
-          <w:szCs w:val="26"/>
+          <w:sz w:val="22"/>
+          <w:szCs w:val="22"/>
           <w:rtl w:val="0"/>
         </w:rPr>
         <w:t xml:space="preserve">{{DEVELOPER}}</w:t>
@@ -383,8 +356,8 @@
       <w:r>
         <w:rPr>
           <w:rFonts w:ascii="Nirmala UI" w:cs="Nirmala UI" w:eastAsia="Nirmala UI" w:hAnsi="Nirmala UI"/>
-          <w:sz w:val="26"/>
-          <w:szCs w:val="26"/>
+          <w:sz w:val="22"/>
+          <w:szCs w:val="22"/>
           <w:rtl w:val="0"/>
         </w:rPr>
         <w:t xml:space="preserve"> द्वारा परियोजना का विकास कार्य सक्षम प्राधिकारी से प्राप्त अनुमति के अनुसार पूर्ण कर दिया गया है एवं सक्षम प्राधिकारी से परियोजना का पूर्णतः प्रमाण पत्र प्राप्त कर लिया है जिसका पूर्णता प्रमाण पत्र क्रमांक </w:t>
@@ -394,8 +367,8 @@
           <w:rFonts w:ascii="Nirmala UI" w:cs="Nirmala UI" w:eastAsia="Nirmala UI" w:hAnsi="Nirmala UI"/>
           <w:b w:val="1"/>
           <w:bCs w:val="1"/>
-          <w:sz w:val="26"/>
-          <w:szCs w:val="26"/>
+          <w:sz w:val="22"/>
+          <w:szCs w:val="22"/>
           <w:rtl w:val="0"/>
         </w:rPr>
         <w:t xml:space="preserve">{{CERT_NO}} दिनांक {{CERT_DATE}}</w:t>
@@ -403,8 +376,8 @@
       <w:r>
         <w:rPr>
           <w:rFonts w:ascii="Nirmala UI" w:cs="Nirmala UI" w:eastAsia="Nirmala UI" w:hAnsi="Nirmala UI"/>
-          <w:sz w:val="26"/>
-          <w:szCs w:val="26"/>
+          <w:sz w:val="22"/>
+          <w:szCs w:val="22"/>
           <w:rtl w:val="0"/>
         </w:rPr>
         <w:t xml:space="preserve"> है उसकी एक प्रति हमको प्रदान कर दी है एवं हम परियोजना के विकास कार्य से पूर्ण संतुष्ट हैं जिस तरह का विकास कार्य का वायदा हमसे किया गया था वैसा ही परियोजना का विकास कार्य किए जाने के कारण अब हम रहवासी गण इस परियोजना के उचित रखरखाव के लिए एक रहवासी संघ का गठन कर रहे हैं इस परियोजना में, मेरे द्वारा </w:t>
@@ -414,8 +387,8 @@
           <w:rFonts w:ascii="Nirmala UI" w:cs="Nirmala UI" w:eastAsia="Nirmala UI" w:hAnsi="Nirmala UI"/>
           <w:b w:val="1"/>
           <w:bCs w:val="1"/>
-          <w:sz w:val="26"/>
-          <w:szCs w:val="26"/>
+          <w:sz w:val="22"/>
+          <w:szCs w:val="22"/>
           <w:rtl w:val="0"/>
         </w:rPr>
         <w:t xml:space="preserve">भूखंड क्रमांक {{PLOT_NO}}</w:t>
@@ -423,8 +396,8 @@
       <w:r>
         <w:rPr>
           <w:rFonts w:ascii="Nirmala UI" w:cs="Nirmala UI" w:eastAsia="Nirmala UI" w:hAnsi="Nirmala UI"/>
-          <w:sz w:val="26"/>
-          <w:szCs w:val="26"/>
+          <w:sz w:val="22"/>
+          <w:szCs w:val="22"/>
           <w:rtl w:val="0"/>
         </w:rPr>
         <w:t xml:space="preserve"> क्रय किया गया है |</w:t>
@@ -442,6 +415,8 @@
         <w:jc w:val="both"/>
         <w:rPr>
           <w:rFonts w:ascii="Nirmala UI" w:cs="Nirmala UI" w:eastAsia="Nirmala UI" w:hAnsi="Nirmala UI"/>
+          <w:sz w:val="22"/>
+          <w:szCs w:val="22"/>
         </w:rPr>
       </w:pPr>
       <w:r>
@@ -459,13 +434,16 @@
         <w:spacing w:after="0" w:line="276" w:lineRule="auto"/>
         <w:ind w:left="1080" w:right="90" w:hanging="360"/>
         <w:jc w:val="both"/>
-        <w:rPr/>
-      </w:pPr>
-      <w:r>
-        <w:rPr>
-          <w:rFonts w:ascii="Nirmala UI" w:cs="Nirmala UI" w:eastAsia="Nirmala UI" w:hAnsi="Nirmala UI"/>
-          <w:sz w:val="26"/>
-          <w:szCs w:val="26"/>
+        <w:rPr>
+          <w:sz w:val="22"/>
+          <w:szCs w:val="22"/>
+        </w:rPr>
+      </w:pPr>
+      <w:r>
+        <w:rPr>
+          <w:rFonts w:ascii="Nirmala UI" w:cs="Nirmala UI" w:eastAsia="Nirmala UI" w:hAnsi="Nirmala UI"/>
+          <w:sz w:val="22"/>
+          <w:szCs w:val="22"/>
           <w:rtl w:val="0"/>
         </w:rPr>
         <w:t xml:space="preserve">यह कि उक्त “</w:t>
@@ -476,8 +454,8 @@
           <w:b w:val="1"/>
           <w:bCs w:val="1"/>
           <w:color w:val="000000"/>
-          <w:sz w:val="26"/>
-          <w:szCs w:val="26"/>
+          <w:sz w:val="22"/>
+          <w:szCs w:val="22"/>
           <w:rtl w:val="0"/>
         </w:rPr>
         <w:t xml:space="preserve">{{ASSOCIATION_NAME}}</w:t>
@@ -485,8 +463,8 @@
       <w:r>
         <w:rPr>
           <w:rFonts w:ascii="Nirmala UI" w:cs="Nirmala UI" w:eastAsia="Nirmala UI" w:hAnsi="Nirmala UI"/>
-          <w:sz w:val="26"/>
-          <w:szCs w:val="26"/>
+          <w:sz w:val="22"/>
+          <w:szCs w:val="22"/>
           <w:rtl w:val="0"/>
         </w:rPr>
         <w:t xml:space="preserve">” परियोजना / परिसर के रख रखाव के लिए “</w:t>
@@ -497,8 +475,8 @@
           <w:b w:val="1"/>
           <w:bCs w:val="1"/>
           <w:color w:val="000000"/>
-          <w:sz w:val="26"/>
-          <w:szCs w:val="26"/>
+          <w:sz w:val="22"/>
+          <w:szCs w:val="22"/>
           <w:rtl w:val="0"/>
         </w:rPr>
         <w:t xml:space="preserve">{{ASSOCIATION_NAME}}</w:t>
@@ -506,8 +484,8 @@
       <w:r>
         <w:rPr>
           <w:rFonts w:ascii="Nirmala UI" w:cs="Nirmala UI" w:eastAsia="Nirmala UI" w:hAnsi="Nirmala UI"/>
-          <w:sz w:val="26"/>
-          <w:szCs w:val="26"/>
+          <w:sz w:val="22"/>
+          <w:szCs w:val="22"/>
           <w:rtl w:val="0"/>
         </w:rPr>
         <w:t xml:space="preserve">” नामक रख रखाव समिति का गठन किया जा रहा है एवं उक्त “</w:t>
@@ -518,8 +496,8 @@
           <w:b w:val="1"/>
           <w:bCs w:val="1"/>
           <w:color w:val="000000"/>
-          <w:sz w:val="26"/>
-          <w:szCs w:val="26"/>
+          <w:sz w:val="22"/>
+          <w:szCs w:val="22"/>
           <w:rtl w:val="0"/>
         </w:rPr>
         <w:t xml:space="preserve">{{PROJECT}}</w:t>
@@ -527,8 +505,8 @@
       <w:r>
         <w:rPr>
           <w:rFonts w:ascii="Nirmala UI" w:cs="Nirmala UI" w:eastAsia="Nirmala UI" w:hAnsi="Nirmala UI"/>
-          <w:sz w:val="26"/>
-          <w:szCs w:val="26"/>
+          <w:sz w:val="22"/>
+          <w:szCs w:val="22"/>
           <w:rtl w:val="0"/>
         </w:rPr>
         <w:t xml:space="preserve">”  परियोजना / परिसर के सदस्यों द्वारा मुझे “</w:t>
@@ -539,8 +517,8 @@
           <w:b w:val="1"/>
           <w:bCs w:val="1"/>
           <w:color w:val="000000"/>
-          <w:sz w:val="26"/>
-          <w:szCs w:val="26"/>
+          <w:sz w:val="22"/>
+          <w:szCs w:val="22"/>
           <w:rtl w:val="0"/>
         </w:rPr>
         <w:t xml:space="preserve">{{ASSOCIATION_NAME}}</w:t>
@@ -548,11 +526,11 @@
       <w:r>
         <w:rPr>
           <w:rFonts w:ascii="Nirmala UI" w:cs="Nirmala UI" w:eastAsia="Nirmala UI" w:hAnsi="Nirmala UI"/>
-          <w:sz w:val="26"/>
-          <w:szCs w:val="26"/>
-          <w:rtl w:val="0"/>
-        </w:rPr>
-        <w:t xml:space="preserve">” का “कार्यकारिणी कोषाध्यक्ष” मनोनीत किया है |</w:t>
+          <w:sz w:val="22"/>
+          <w:szCs w:val="22"/>
+          <w:rtl w:val="0"/>
+        </w:rPr>
+        <w:t>” का “कार्यकारिणी {{MEMBER_DESIGNATION}}” मनोनीत किया है |</w:t>
       </w:r>
       <w:r>
         <w:rPr>
@@ -586,8 +564,8 @@
           <w:smallCaps w:val="0"/>
           <w:strike w:val="0"/>
           <w:color w:val="000000"/>
-          <w:sz w:val="24"/>
-          <w:szCs w:val="24"/>
+          <w:sz w:val="22"/>
+          <w:szCs w:val="22"/>
           <w:u w:val="none"/>
           <w:shd w:fill="auto" w:val="clear"/>
           <w:vertAlign w:val="baseline"/>
@@ -611,13 +589,16 @@
         <w:spacing w:after="0" w:line="276" w:lineRule="auto"/>
         <w:ind w:left="1080" w:right="90" w:hanging="360"/>
         <w:jc w:val="both"/>
-        <w:rPr/>
-      </w:pPr>
-      <w:r>
-        <w:rPr>
-          <w:rFonts w:ascii="Nirmala UI" w:cs="Nirmala UI" w:eastAsia="Nirmala UI" w:hAnsi="Nirmala UI"/>
-          <w:sz w:val="26"/>
-          <w:szCs w:val="26"/>
+        <w:rPr>
+          <w:sz w:val="22"/>
+          <w:szCs w:val="22"/>
+        </w:rPr>
+      </w:pPr>
+      <w:r>
+        <w:rPr>
+          <w:rFonts w:ascii="Nirmala UI" w:cs="Nirmala UI" w:eastAsia="Nirmala UI" w:hAnsi="Nirmala UI"/>
+          <w:sz w:val="22"/>
+          <w:szCs w:val="22"/>
           <w:rtl w:val="0"/>
         </w:rPr>
         <w:t xml:space="preserve">यह कि मध्यप्रदेश भूखंड स्वमित्व अधिनियम 2000 की धारा 18 के अंतर्गत श्रीमान सक्षम प्राधिकारी श्रीमान अनुविभागीय अधिकारी महोदय </w:t>
@@ -627,8 +608,8 @@
           <w:rFonts w:ascii="Nirmala UI" w:cs="Nirmala UI" w:eastAsia="Nirmala UI" w:hAnsi="Nirmala UI"/>
           <w:b w:val="1"/>
           <w:bCs w:val="1"/>
-          <w:sz w:val="26"/>
-          <w:szCs w:val="26"/>
+          <w:sz w:val="22"/>
+          <w:szCs w:val="22"/>
           <w:rtl w:val="0"/>
         </w:rPr>
         <w:t xml:space="preserve">{{AUTHORITY_LOCATION}}</w:t>
@@ -636,8 +617,8 @@
       <w:r>
         <w:rPr>
           <w:rFonts w:ascii="Nirmala UI" w:cs="Nirmala UI" w:eastAsia="Nirmala UI" w:hAnsi="Nirmala UI"/>
-          <w:sz w:val="26"/>
-          <w:szCs w:val="26"/>
+          <w:sz w:val="22"/>
+          <w:szCs w:val="22"/>
           <w:rtl w:val="0"/>
         </w:rPr>
         <w:t xml:space="preserve"> के कार्यालय में पंजीयन हेतु आवेदन प्रस्तुत किया जा रहा है, जिसके समर्थन में मेरे द्वारा यह शपथ पत्र प्रस्तुत किया जा रहा है |</w:t>
@@ -656,7 +637,10 @@
         <w:spacing w:after="0" w:line="276" w:lineRule="auto"/>
         <w:ind w:left="1080" w:right="90" w:firstLine="0"/>
         <w:jc w:val="both"/>
-        <w:rPr/>
+        <w:rPr>
+          <w:sz w:val="22"/>
+          <w:szCs w:val="22"/>
+        </w:rPr>
       </w:pPr>
       <w:r>
         <w:rPr>
@@ -676,13 +660,16 @@
         <w:spacing w:after="0" w:line="276" w:lineRule="auto"/>
         <w:ind w:left="1080" w:right="90" w:hanging="360"/>
         <w:jc w:val="both"/>
-        <w:rPr/>
-      </w:pPr>
-      <w:r>
-        <w:rPr>
-          <w:rFonts w:ascii="Nirmala UI" w:cs="Nirmala UI" w:eastAsia="Nirmala UI" w:hAnsi="Nirmala UI"/>
-          <w:sz w:val="26"/>
-          <w:szCs w:val="26"/>
+        <w:rPr>
+          <w:sz w:val="22"/>
+          <w:szCs w:val="22"/>
+        </w:rPr>
+      </w:pPr>
+      <w:r>
+        <w:rPr>
+          <w:rFonts w:ascii="Nirmala UI" w:cs="Nirmala UI" w:eastAsia="Nirmala UI" w:hAnsi="Nirmala UI"/>
+          <w:sz w:val="22"/>
+          <w:szCs w:val="22"/>
           <w:rtl w:val="0"/>
         </w:rPr>
         <w:t xml:space="preserve">यह कि में </w:t>
@@ -692,8 +679,8 @@
           <w:rFonts w:ascii="Nirmala UI" w:cs="Nirmala UI" w:eastAsia="Nirmala UI" w:hAnsi="Nirmala UI"/>
           <w:b w:val="1"/>
           <w:bCs w:val="1"/>
-          <w:sz w:val="26"/>
-          <w:szCs w:val="26"/>
+          <w:sz w:val="22"/>
+          <w:szCs w:val="22"/>
           <w:rtl w:val="0"/>
         </w:rPr>
         <w:t xml:space="preserve">{{NAME}}</w:t>
@@ -701,19 +688,19 @@
       <w:r>
         <w:rPr>
           <w:rFonts w:ascii="Nirmala UI" w:cs="Nirmala UI" w:eastAsia="Nirmala UI" w:hAnsi="Nirmala UI"/>
-          <w:sz w:val="26"/>
-          <w:szCs w:val="26"/>
-          <w:rtl w:val="0"/>
-        </w:rPr>
-        <w:t xml:space="preserve"> मनोनीत कार्यकारिणी कोषाध्यक्ष, “</w:t>
-      </w:r>
-      <w:r>
-        <w:rPr>
-          <w:rFonts w:ascii="Nirmala UI" w:cs="Nirmala UI" w:eastAsia="Nirmala UI" w:hAnsi="Nirmala UI"/>
-          <w:b w:val="1"/>
-          <w:bCs w:val="1"/>
-          <w:sz w:val="26"/>
-          <w:szCs w:val="26"/>
+          <w:sz w:val="22"/>
+          <w:szCs w:val="22"/>
+          <w:rtl w:val="0"/>
+        </w:rPr>
+        <w:t xml:space="preserve"> मनोनीत कार्यकारिणी {{MEMBER_DESIGNATION}}, “</w:t>
+      </w:r>
+      <w:r>
+        <w:rPr>
+          <w:rFonts w:ascii="Nirmala UI" w:cs="Nirmala UI" w:eastAsia="Nirmala UI" w:hAnsi="Nirmala UI"/>
+          <w:b w:val="1"/>
+          <w:bCs w:val="1"/>
+          <w:sz w:val="22"/>
+          <w:szCs w:val="22"/>
           <w:rtl w:val="0"/>
         </w:rPr>
         <w:t xml:space="preserve">{{ASSOCIATION_NAME}}</w:t>
@@ -721,8 +708,8 @@
       <w:r>
         <w:rPr>
           <w:rFonts w:ascii="Nirmala UI" w:cs="Nirmala UI" w:eastAsia="Nirmala UI" w:hAnsi="Nirmala UI"/>
-          <w:sz w:val="26"/>
-          <w:szCs w:val="26"/>
+          <w:sz w:val="22"/>
+          <w:szCs w:val="22"/>
           <w:rtl w:val="0"/>
         </w:rPr>
         <w:t xml:space="preserve">” मध्यप्रदेश प्रकोष्ठ स्वामित्व अधिनियम के सभी नियमों का पूर्ण रूप से पालन करूँगा |</w:t>
@@ -743,8 +730,8 @@
         <w:jc w:val="both"/>
         <w:rPr>
           <w:rFonts w:ascii="Nirmala UI" w:cs="Nirmala UI" w:eastAsia="Nirmala UI" w:hAnsi="Nirmala UI"/>
-          <w:sz w:val="26"/>
-          <w:szCs w:val="26"/>
+          <w:sz w:val="22"/>
+          <w:szCs w:val="22"/>
         </w:rPr>
       </w:pPr>
       <w:r>
@@ -765,13 +752,16 @@
         <w:spacing w:after="0" w:line="276" w:lineRule="auto"/>
         <w:ind w:left="1080" w:right="90" w:hanging="360"/>
         <w:jc w:val="both"/>
-        <w:rPr/>
-      </w:pPr>
-      <w:r>
-        <w:rPr>
-          <w:rFonts w:ascii="Nirmala UI" w:cs="Nirmala UI" w:eastAsia="Nirmala UI" w:hAnsi="Nirmala UI"/>
-          <w:sz w:val="26"/>
-          <w:szCs w:val="26"/>
+        <w:rPr>
+          <w:sz w:val="22"/>
+          <w:szCs w:val="22"/>
+        </w:rPr>
+      </w:pPr>
+      <w:r>
+        <w:rPr>
+          <w:rFonts w:ascii="Nirmala UI" w:cs="Nirmala UI" w:eastAsia="Nirmala UI" w:hAnsi="Nirmala UI"/>
+          <w:sz w:val="22"/>
+          <w:szCs w:val="22"/>
           <w:rtl w:val="0"/>
         </w:rPr>
         <w:t xml:space="preserve">यह शपथ पत्र मैंने “</w:t>
@@ -781,8 +771,8 @@
           <w:rFonts w:ascii="Nirmala UI" w:cs="Nirmala UI" w:eastAsia="Nirmala UI" w:hAnsi="Nirmala UI"/>
           <w:b w:val="1"/>
           <w:bCs w:val="1"/>
-          <w:sz w:val="26"/>
-          <w:szCs w:val="26"/>
+          <w:sz w:val="22"/>
+          <w:szCs w:val="22"/>
           <w:rtl w:val="0"/>
         </w:rPr>
         <w:t xml:space="preserve">{{ASSOCIATION_NAME}}</w:t>
@@ -790,11 +780,16 @@
       <w:r>
         <w:rPr>
           <w:rFonts w:ascii="Nirmala UI" w:cs="Nirmala UI" w:eastAsia="Nirmala UI" w:hAnsi="Nirmala UI"/>
-          <w:sz w:val="26"/>
-          <w:szCs w:val="26"/>
+          <w:sz w:val="22"/>
+          <w:szCs w:val="22"/>
           <w:rtl w:val="0"/>
         </w:rPr>
         <w:t xml:space="preserve"> ” का पंजीयन किये जाने बाबद उपरोक्त समस्त कथन में दिया हैं | सो सही ताकि प्रमाण रहे |</w:t>
+      </w:r>
+      <w:r>
+        <w:rPr>
+          <w:rtl w:val="0"/>
+        </w:rPr>
       </w:r>
     </w:p>
     <w:p>
@@ -807,8 +802,8 @@
         <w:jc w:val="both"/>
         <w:rPr>
           <w:rFonts w:ascii="Nirmala UI" w:cs="Nirmala UI" w:eastAsia="Nirmala UI" w:hAnsi="Nirmala UI"/>
-          <w:sz w:val="26"/>
-          <w:szCs w:val="26"/>
+          <w:sz w:val="22"/>
+          <w:szCs w:val="22"/>
         </w:rPr>
       </w:pPr>
       <w:r>
@@ -827,8 +822,8 @@
         <w:jc w:val="both"/>
         <w:rPr>
           <w:rFonts w:ascii="Nirmala UI" w:cs="Nirmala UI" w:eastAsia="Nirmala UI" w:hAnsi="Nirmala UI"/>
-          <w:sz w:val="26"/>
-          <w:szCs w:val="26"/>
+          <w:sz w:val="22"/>
+          <w:szCs w:val="22"/>
         </w:rPr>
       </w:pPr>
       <w:r>
@@ -844,15 +839,17 @@
         <w:jc w:val="both"/>
         <w:rPr>
           <w:rFonts w:ascii="Mangal" w:cs="Mangal" w:eastAsia="Mangal" w:hAnsi="Mangal"/>
-        </w:rPr>
-      </w:pPr>
-      <w:r>
-        <w:rPr>
-          <w:rFonts w:ascii="Nirmala UI" w:cs="Nirmala UI" w:eastAsia="Nirmala UI" w:hAnsi="Nirmala UI"/>
-          <w:b w:val="1"/>
-          <w:bCs w:val="1"/>
-          <w:sz w:val="26"/>
-          <w:szCs w:val="26"/>
+          <w:sz w:val="22"/>
+          <w:szCs w:val="22"/>
+        </w:rPr>
+      </w:pPr>
+      <w:r>
+        <w:rPr>
+          <w:rFonts w:ascii="Nirmala UI" w:cs="Nirmala UI" w:eastAsia="Nirmala UI" w:hAnsi="Nirmala UI"/>
+          <w:b w:val="1"/>
+          <w:bCs w:val="1"/>
+          <w:sz w:val="22"/>
+          <w:szCs w:val="22"/>
           <w:rtl w:val="0"/>
         </w:rPr>
         <w:t xml:space="preserve">दिनांक _________</w:t>
@@ -872,15 +869,17 @@
         <w:jc w:val="both"/>
         <w:rPr>
           <w:rFonts w:ascii="Nirmala UI" w:cs="Nirmala UI" w:eastAsia="Nirmala UI" w:hAnsi="Nirmala UI"/>
-        </w:rPr>
-      </w:pPr>
-      <w:r>
-        <w:rPr>
-          <w:rFonts w:ascii="Nirmala UI" w:cs="Nirmala UI" w:eastAsia="Nirmala UI" w:hAnsi="Nirmala UI"/>
-          <w:b w:val="1"/>
-          <w:bCs w:val="1"/>
-          <w:sz w:val="26"/>
-          <w:szCs w:val="26"/>
+          <w:sz w:val="22"/>
+          <w:szCs w:val="22"/>
+        </w:rPr>
+      </w:pPr>
+      <w:r>
+        <w:rPr>
+          <w:rFonts w:ascii="Nirmala UI" w:cs="Nirmala UI" w:eastAsia="Nirmala UI" w:hAnsi="Nirmala UI"/>
+          <w:b w:val="1"/>
+          <w:bCs w:val="1"/>
+          <w:sz w:val="22"/>
+          <w:szCs w:val="22"/>
           <w:rtl w:val="0"/>
         </w:rPr>
         <w:t xml:space="preserve">स्थान</w:t>
@@ -888,8 +887,8 @@
       <w:r>
         <w:rPr>
           <w:rFonts w:ascii="Nirmala UI" w:cs="Nirmala UI" w:eastAsia="Nirmala UI" w:hAnsi="Nirmala UI"/>
-          <w:sz w:val="26"/>
-          <w:szCs w:val="26"/>
+          <w:sz w:val="22"/>
+          <w:szCs w:val="22"/>
           <w:rtl w:val="0"/>
         </w:rPr>
         <w:t xml:space="preserve">  -  </w:t>
@@ -899,8 +898,8 @@
           <w:rFonts w:ascii="Nirmala UI" w:cs="Nirmala UI" w:eastAsia="Nirmala UI" w:hAnsi="Nirmala UI"/>
           <w:b w:val="1"/>
           <w:bCs w:val="1"/>
-          <w:sz w:val="26"/>
-          <w:szCs w:val="26"/>
+          <w:sz w:val="22"/>
+          <w:szCs w:val="22"/>
           <w:rtl w:val="0"/>
         </w:rPr>
         <w:t xml:space="preserve">{{CITY}}</w:t>
@@ -908,8 +907,8 @@
       <w:r>
         <w:rPr>
           <w:rFonts w:ascii="Nirmala UI" w:cs="Nirmala UI" w:eastAsia="Nirmala UI" w:hAnsi="Nirmala UI"/>
-          <w:sz w:val="26"/>
-          <w:szCs w:val="26"/>
+          <w:sz w:val="22"/>
+          <w:szCs w:val="22"/>
           <w:rtl w:val="0"/>
         </w:rPr>
         <w:tab/>
@@ -920,11 +919,11 @@
           <w:rFonts w:ascii="Nirmala UI" w:cs="Nirmala UI" w:eastAsia="Nirmala UI" w:hAnsi="Nirmala UI"/>
           <w:b w:val="1"/>
           <w:bCs w:val="1"/>
-          <w:sz w:val="26"/>
-          <w:szCs w:val="26"/>
-          <w:rtl w:val="0"/>
-        </w:rPr>
-        <w:t xml:space="preserve">मनोनीत कार्यकारिणी कोषाध्यक्ष</w:t>
+          <w:sz w:val="22"/>
+          <w:szCs w:val="22"/>
+          <w:rtl w:val="0"/>
+        </w:rPr>
+        <w:t>मनोनीत कार्यकारिणी {{MEMBER_DESIGNATION}}</w:t>
       </w:r>
       <w:r>
         <w:rPr>
@@ -942,8 +941,8 @@
           <w:rFonts w:ascii="Nirmala UI" w:cs="Nirmala UI" w:eastAsia="Nirmala UI" w:hAnsi="Nirmala UI"/>
           <w:b w:val="1"/>
           <w:bCs w:val="1"/>
-          <w:sz w:val="36"/>
-          <w:szCs w:val="36"/>
+          <w:sz w:val="22"/>
+          <w:szCs w:val="22"/>
           <w:u w:val="single"/>
         </w:rPr>
       </w:pPr>
@@ -962,6 +961,8 @@
           <w:rFonts w:ascii="Nirmala UI" w:cs="Nirmala UI" w:eastAsia="Nirmala UI" w:hAnsi="Nirmala UI"/>
           <w:b w:val="1"/>
           <w:bCs w:val="1"/>
+          <w:sz w:val="22"/>
+          <w:szCs w:val="22"/>
           <w:u w:val="single"/>
         </w:rPr>
       </w:pPr>
@@ -970,17 +971,12 @@
           <w:rFonts w:ascii="Nirmala UI" w:cs="Nirmala UI" w:eastAsia="Nirmala UI" w:hAnsi="Nirmala UI"/>
           <w:b w:val="1"/>
           <w:bCs w:val="1"/>
-          <w:sz w:val="36"/>
-          <w:szCs w:val="36"/>
+          <w:sz w:val="22"/>
+          <w:szCs w:val="22"/>
           <w:u w:val="single"/>
           <w:rtl w:val="0"/>
         </w:rPr>
         <w:t xml:space="preserve">सत्यापन लेख</w:t>
-      </w:r>
-      <w:r>
-        <w:rPr>
-          <w:rtl w:val="0"/>
-        </w:rPr>
       </w:r>
     </w:p>
     <w:p>
@@ -992,6 +988,8 @@
           <w:rFonts w:ascii="Nirmala UI" w:cs="Nirmala UI" w:eastAsia="Nirmala UI" w:hAnsi="Nirmala UI"/>
           <w:b w:val="1"/>
           <w:bCs w:val="1"/>
+          <w:sz w:val="22"/>
+          <w:szCs w:val="22"/>
           <w:u w:val="single"/>
         </w:rPr>
       </w:pPr>
@@ -1008,13 +1006,15 @@
         <w:jc w:val="both"/>
         <w:rPr>
           <w:rFonts w:ascii="Kruti Dev 010" w:cs="Kruti Dev 010" w:eastAsia="Kruti Dev 010" w:hAnsi="Kruti Dev 010"/>
-        </w:rPr>
-      </w:pPr>
-      <w:r>
-        <w:rPr>
-          <w:rFonts w:ascii="Nirmala UI" w:cs="Nirmala UI" w:eastAsia="Nirmala UI" w:hAnsi="Nirmala UI"/>
-          <w:sz w:val="26"/>
-          <w:szCs w:val="26"/>
+          <w:sz w:val="22"/>
+          <w:szCs w:val="22"/>
+        </w:rPr>
+      </w:pPr>
+      <w:r>
+        <w:rPr>
+          <w:rFonts w:ascii="Nirmala UI" w:cs="Nirmala UI" w:eastAsia="Nirmala UI" w:hAnsi="Nirmala UI"/>
+          <w:sz w:val="22"/>
+          <w:szCs w:val="22"/>
           <w:rtl w:val="0"/>
         </w:rPr>
         <w:t xml:space="preserve">मैं शपथपूर्वक उपरोक्त कथन सत्यापित करता/ करती हूँ कि उपरोक्त शपथ पत्र का समस्त कथन मेरी निजी जानकारी एवं विश्वास से सत्य एवं सही है, इसमें कुछ भी असत्य कथन नही किया गया होकर किसी भी तथ्यगत बात को छुपाया नहीं गया है| आज दिनांक _________को जिला {{CITY}} में मेने इस पर अपने हस्ताक्षर करके इसे सत्यापित किय है|</w:t>
@@ -1032,6 +1032,8 @@
         <w:jc w:val="both"/>
         <w:rPr>
           <w:rFonts w:ascii="Nirmala UI" w:cs="Nirmala UI" w:eastAsia="Nirmala UI" w:hAnsi="Nirmala UI"/>
+          <w:sz w:val="22"/>
+          <w:szCs w:val="22"/>
         </w:rPr>
       </w:pPr>
       <w:r>
@@ -1047,6 +1049,8 @@
         <w:jc w:val="both"/>
         <w:rPr>
           <w:rFonts w:ascii="Nirmala UI" w:cs="Nirmala UI" w:eastAsia="Nirmala UI" w:hAnsi="Nirmala UI"/>
+          <w:sz w:val="22"/>
+          <w:szCs w:val="22"/>
         </w:rPr>
       </w:pPr>
       <w:r>
@@ -1065,13 +1069,15 @@
         <w:jc w:val="both"/>
         <w:rPr>
           <w:rFonts w:ascii="Kruti Dev 010" w:cs="Kruti Dev 010" w:eastAsia="Kruti Dev 010" w:hAnsi="Kruti Dev 010"/>
-        </w:rPr>
-      </w:pPr>
-      <w:r>
-        <w:rPr>
-          <w:rFonts w:ascii="Nirmala UI" w:cs="Nirmala UI" w:eastAsia="Nirmala UI" w:hAnsi="Nirmala UI"/>
-          <w:sz w:val="26"/>
-          <w:szCs w:val="26"/>
+          <w:sz w:val="22"/>
+          <w:szCs w:val="22"/>
+        </w:rPr>
+      </w:pPr>
+      <w:r>
+        <w:rPr>
+          <w:rFonts w:ascii="Nirmala UI" w:cs="Nirmala UI" w:eastAsia="Nirmala UI" w:hAnsi="Nirmala UI"/>
+          <w:sz w:val="22"/>
+          <w:szCs w:val="22"/>
           <w:rtl w:val="0"/>
         </w:rPr>
         <w:t xml:space="preserve">दिनांक: _________</w:t>
@@ -1081,11 +1087,11 @@
           <w:rFonts w:ascii="Nirmala UI" w:cs="Nirmala UI" w:eastAsia="Nirmala UI" w:hAnsi="Nirmala UI"/>
           <w:b w:val="1"/>
           <w:bCs w:val="1"/>
-          <w:sz w:val="26"/>
-          <w:szCs w:val="26"/>
-          <w:rtl w:val="0"/>
-        </w:rPr>
-        <w:t xml:space="preserve">                                                                              {{NAME}}</w:t>
+          <w:sz w:val="22"/>
+          <w:szCs w:val="22"/>
+          <w:rtl w:val="0"/>
+        </w:rPr>
+        <w:t xml:space="preserve">                                                                                               {{NAME}}</w:t>
       </w:r>
       <w:r>
         <w:rPr>
@@ -1103,13 +1109,15 @@
         <w:jc w:val="both"/>
         <w:rPr>
           <w:rFonts w:ascii="Kruti Dev 010" w:cs="Kruti Dev 010" w:eastAsia="Kruti Dev 010" w:hAnsi="Kruti Dev 010"/>
-        </w:rPr>
-      </w:pPr>
-      <w:r>
-        <w:rPr>
-          <w:rFonts w:ascii="Nirmala UI" w:cs="Nirmala UI" w:eastAsia="Nirmala UI" w:hAnsi="Nirmala UI"/>
-          <w:sz w:val="26"/>
-          <w:szCs w:val="26"/>
+          <w:sz w:val="22"/>
+          <w:szCs w:val="22"/>
+        </w:rPr>
+      </w:pPr>
+      <w:r>
+        <w:rPr>
+          <w:rFonts w:ascii="Nirmala UI" w:cs="Nirmala UI" w:eastAsia="Nirmala UI" w:hAnsi="Nirmala UI"/>
+          <w:sz w:val="22"/>
+          <w:szCs w:val="22"/>
           <w:rtl w:val="0"/>
         </w:rPr>
         <w:t xml:space="preserve">स्थान :   {{CITY}}</w:t>
@@ -1119,11 +1127,11 @@
           <w:rFonts w:ascii="Nirmala UI" w:cs="Nirmala UI" w:eastAsia="Nirmala UI" w:hAnsi="Nirmala UI"/>
           <w:b w:val="1"/>
           <w:bCs w:val="1"/>
-          <w:sz w:val="26"/>
-          <w:szCs w:val="26"/>
-          <w:rtl w:val="0"/>
-        </w:rPr>
-        <w:t xml:space="preserve">                                                                        कार्यकारिणी कोषाध्यक्ष</w:t>
+          <w:sz w:val="22"/>
+          <w:szCs w:val="22"/>
+          <w:rtl w:val="0"/>
+        </w:rPr>
+        <w:t xml:space="preserve">                                                                                           कार्यकारिणी {{MEMBER_DESIGNATION}}</w:t>
       </w:r>
       <w:r>
         <w:rPr>
@@ -1139,15 +1147,18 @@
         <w:spacing w:after="0" w:line="276" w:lineRule="auto"/>
         <w:ind w:right="90"/>
         <w:jc w:val="both"/>
-        <w:rPr/>
-      </w:pPr>
-      <w:r>
-        <w:rPr>
-          <w:rFonts w:ascii="Nirmala UI" w:cs="Nirmala UI" w:eastAsia="Nirmala UI" w:hAnsi="Nirmala UI"/>
-          <w:b w:val="1"/>
-          <w:bCs w:val="1"/>
-          <w:sz w:val="26"/>
-          <w:szCs w:val="26"/>
+        <w:rPr>
+          <w:sz w:val="22"/>
+          <w:szCs w:val="22"/>
+        </w:rPr>
+      </w:pPr>
+      <w:r>
+        <w:rPr>
+          <w:rFonts w:ascii="Nirmala UI" w:cs="Nirmala UI" w:eastAsia="Nirmala UI" w:hAnsi="Nirmala UI"/>
+          <w:b w:val="1"/>
+          <w:bCs w:val="1"/>
+          <w:sz w:val="22"/>
+          <w:szCs w:val="22"/>
           <w:rtl w:val="0"/>
         </w:rPr>
         <w:tab/>
@@ -1160,12 +1171,78 @@
       </w:r>
     </w:p>
     <w:sectPr>
+      <w:headerReference w:type="default" r:id="rId7"/>
+      <w:footerReference w:type="default" r:id="rId8"/>
+      <w:headerReference w:type="first" r:id="rId9"/>
+      <w:footerReference w:type="first" r:id="rId10"/>
+      <w:headerReference w:type="even" r:id="rId11"/>
+      <w:footerReference w:type="even" r:id="rId12"/>
       <w:pgSz w:h="16838" w:w="11906" w:orient="portrait"/>
       <w:pgMar w:bottom="1440" w:top="142" w:left="270" w:right="660" w:header="720" w:footer="720"/>
       <w:pgNumType w:start="1"/>
     </w:sectPr>
   </w:body>
 </w:document>
+</file>
+
+<file path=word/footer1.xml><?xml version="1.0" encoding="utf-8"?>
+<w:ftr xmlns:m="http://schemas.openxmlformats.org/officeDocument/2006/math" xmlns:mc="http://schemas.openxmlformats.org/markup-compatibility/2006" xmlns:mo="http://schemas.microsoft.com/office/mac/office/2008/main" xmlns:mv="urn:schemas-microsoft-com:mac:vml" xmlns:o="urn:schemas-microsoft-com:office:office" xmlns:r="http://schemas.openxmlformats.org/officeDocument/2006/relationships" xmlns:v="urn:schemas-microsoft-com:vml" xmlns:w10="urn:schemas-microsoft-com:office:word" xmlns:w14="http://schemas.microsoft.com/office/word/2010/wordml" xmlns:w="http://schemas.openxmlformats.org/wordprocessingml/2006/main" xmlns:wne="http://schemas.microsoft.com/office/word/2006/wordml" xmlns:wp14="http://schemas.microsoft.com/office/word/2010/wordprocessingDrawing" xmlns:wp="http://schemas.openxmlformats.org/drawingml/2006/wordprocessingDrawing" xmlns:wpc="http://schemas.microsoft.com/office/word/2010/wordprocessingCanvas" xmlns:wpg="http://schemas.microsoft.com/office/word/2010/wordprocessingGroup" xmlns:wpi="http://schemas.microsoft.com/office/word/2010/wordprocessingInk" xmlns:wps="http://schemas.microsoft.com/office/word/2010/wordprocessingShape" mc:Ignorable="w14 wp14">
+  <w:p>
+    <w:pPr>
+      <w:pStyle w:val="Footer"/>
+    </w:pPr>
+  </w:p>
+</w:ftr>
+</file>
+
+<file path=word/footer2.xml><?xml version="1.0" encoding="utf-8"?>
+<w:ftr xmlns:m="http://schemas.openxmlformats.org/officeDocument/2006/math" xmlns:mc="http://schemas.openxmlformats.org/markup-compatibility/2006" xmlns:mo="http://schemas.microsoft.com/office/mac/office/2008/main" xmlns:mv="urn:schemas-microsoft-com:mac:vml" xmlns:o="urn:schemas-microsoft-com:office:office" xmlns:r="http://schemas.openxmlformats.org/officeDocument/2006/relationships" xmlns:v="urn:schemas-microsoft-com:vml" xmlns:w10="urn:schemas-microsoft-com:office:word" xmlns:w14="http://schemas.microsoft.com/office/word/2010/wordml" xmlns:w="http://schemas.openxmlformats.org/wordprocessingml/2006/main" xmlns:wne="http://schemas.microsoft.com/office/word/2006/wordml" xmlns:wp14="http://schemas.microsoft.com/office/word/2010/wordprocessingDrawing" xmlns:wp="http://schemas.openxmlformats.org/drawingml/2006/wordprocessingDrawing" xmlns:wpc="http://schemas.microsoft.com/office/word/2010/wordprocessingCanvas" xmlns:wpg="http://schemas.microsoft.com/office/word/2010/wordprocessingGroup" xmlns:wpi="http://schemas.microsoft.com/office/word/2010/wordprocessingInk" xmlns:wps="http://schemas.microsoft.com/office/word/2010/wordprocessingShape" mc:Ignorable="w14 wp14">
+  <w:p>
+    <w:pPr>
+      <w:pStyle w:val="Footer"/>
+    </w:pPr>
+  </w:p>
+</w:ftr>
+</file>
+
+<file path=word/footer3.xml><?xml version="1.0" encoding="utf-8"?>
+<w:ftr xmlns:m="http://schemas.openxmlformats.org/officeDocument/2006/math" xmlns:mc="http://schemas.openxmlformats.org/markup-compatibility/2006" xmlns:mo="http://schemas.microsoft.com/office/mac/office/2008/main" xmlns:mv="urn:schemas-microsoft-com:mac:vml" xmlns:o="urn:schemas-microsoft-com:office:office" xmlns:r="http://schemas.openxmlformats.org/officeDocument/2006/relationships" xmlns:v="urn:schemas-microsoft-com:vml" xmlns:w10="urn:schemas-microsoft-com:office:word" xmlns:w14="http://schemas.microsoft.com/office/word/2010/wordml" xmlns:w="http://schemas.openxmlformats.org/wordprocessingml/2006/main" xmlns:wne="http://schemas.microsoft.com/office/word/2006/wordml" xmlns:wp14="http://schemas.microsoft.com/office/word/2010/wordprocessingDrawing" xmlns:wp="http://schemas.openxmlformats.org/drawingml/2006/wordprocessingDrawing" xmlns:wpc="http://schemas.microsoft.com/office/word/2010/wordprocessingCanvas" xmlns:wpg="http://schemas.microsoft.com/office/word/2010/wordprocessingGroup" xmlns:wpi="http://schemas.microsoft.com/office/word/2010/wordprocessingInk" xmlns:wps="http://schemas.microsoft.com/office/word/2010/wordprocessingShape" mc:Ignorable="w14 wp14">
+  <w:p>
+    <w:pPr>
+      <w:pStyle w:val="Footer"/>
+    </w:pPr>
+  </w:p>
+</w:ftr>
+</file>
+
+<file path=word/header1.xml><?xml version="1.0" encoding="utf-8"?>
+<w:hdr xmlns:m="http://schemas.openxmlformats.org/officeDocument/2006/math" xmlns:mc="http://schemas.openxmlformats.org/markup-compatibility/2006" xmlns:mo="http://schemas.microsoft.com/office/mac/office/2008/main" xmlns:mv="urn:schemas-microsoft-com:mac:vml" xmlns:o="urn:schemas-microsoft-com:office:office" xmlns:r="http://schemas.openxmlformats.org/officeDocument/2006/relationships" xmlns:v="urn:schemas-microsoft-com:vml" xmlns:w10="urn:schemas-microsoft-com:office:word" xmlns:w14="http://schemas.microsoft.com/office/word/2010/wordml" xmlns:w="http://schemas.openxmlformats.org/wordprocessingml/2006/main" xmlns:wne="http://schemas.microsoft.com/office/word/2006/wordml" xmlns:wp14="http://schemas.microsoft.com/office/word/2010/wordprocessingDrawing" xmlns:wp="http://schemas.openxmlformats.org/drawingml/2006/wordprocessingDrawing" xmlns:wpc="http://schemas.microsoft.com/office/word/2010/wordprocessingCanvas" xmlns:wpg="http://schemas.microsoft.com/office/word/2010/wordprocessingGroup" xmlns:wpi="http://schemas.microsoft.com/office/word/2010/wordprocessingInk" xmlns:wps="http://schemas.microsoft.com/office/word/2010/wordprocessingShape" mc:Ignorable="w14 wp14">
+  <w:p>
+    <w:pPr>
+      <w:pStyle w:val="Header"/>
+    </w:pPr>
+  </w:p>
+</w:hdr>
+</file>
+
+<file path=word/header2.xml><?xml version="1.0" encoding="utf-8"?>
+<w:hdr xmlns:m="http://schemas.openxmlformats.org/officeDocument/2006/math" xmlns:mc="http://schemas.openxmlformats.org/markup-compatibility/2006" xmlns:mo="http://schemas.microsoft.com/office/mac/office/2008/main" xmlns:mv="urn:schemas-microsoft-com:mac:vml" xmlns:o="urn:schemas-microsoft-com:office:office" xmlns:r="http://schemas.openxmlformats.org/officeDocument/2006/relationships" xmlns:v="urn:schemas-microsoft-com:vml" xmlns:w10="urn:schemas-microsoft-com:office:word" xmlns:w14="http://schemas.microsoft.com/office/word/2010/wordml" xmlns:w="http://schemas.openxmlformats.org/wordprocessingml/2006/main" xmlns:wne="http://schemas.microsoft.com/office/word/2006/wordml" xmlns:wp14="http://schemas.microsoft.com/office/word/2010/wordprocessingDrawing" xmlns:wp="http://schemas.openxmlformats.org/drawingml/2006/wordprocessingDrawing" xmlns:wpc="http://schemas.microsoft.com/office/word/2010/wordprocessingCanvas" xmlns:wpg="http://schemas.microsoft.com/office/word/2010/wordprocessingGroup" xmlns:wpi="http://schemas.microsoft.com/office/word/2010/wordprocessingInk" xmlns:wps="http://schemas.microsoft.com/office/word/2010/wordprocessingShape" mc:Ignorable="w14 wp14">
+  <w:p>
+    <w:pPr>
+      <w:pStyle w:val="Header"/>
+    </w:pPr>
+  </w:p>
+</w:hdr>
+</file>
+
+<file path=word/header3.xml><?xml version="1.0" encoding="utf-8"?>
+<w:hdr xmlns:m="http://schemas.openxmlformats.org/officeDocument/2006/math" xmlns:mc="http://schemas.openxmlformats.org/markup-compatibility/2006" xmlns:mo="http://schemas.microsoft.com/office/mac/office/2008/main" xmlns:mv="urn:schemas-microsoft-com:mac:vml" xmlns:o="urn:schemas-microsoft-com:office:office" xmlns:r="http://schemas.openxmlformats.org/officeDocument/2006/relationships" xmlns:v="urn:schemas-microsoft-com:vml" xmlns:w10="urn:schemas-microsoft-com:office:word" xmlns:w14="http://schemas.microsoft.com/office/word/2010/wordml" xmlns:w="http://schemas.openxmlformats.org/wordprocessingml/2006/main" xmlns:wne="http://schemas.microsoft.com/office/word/2006/wordml" xmlns:wp14="http://schemas.microsoft.com/office/word/2010/wordprocessingDrawing" xmlns:wp="http://schemas.openxmlformats.org/drawingml/2006/wordprocessingDrawing" xmlns:wpc="http://schemas.microsoft.com/office/word/2010/wordprocessingCanvas" xmlns:wpg="http://schemas.microsoft.com/office/word/2010/wordprocessingGroup" xmlns:wpi="http://schemas.microsoft.com/office/word/2010/wordprocessingInk" xmlns:wps="http://schemas.microsoft.com/office/word/2010/wordprocessingShape" mc:Ignorable="w14 wp14">
+  <w:p>
+    <w:pPr>
+      <w:pStyle w:val="Header"/>
+    </w:pPr>
+  </w:p>
+</w:hdr>
 </file>
 
 <file path=word/numbering.xml><?xml version="1.0" encoding="utf-8"?>
@@ -1403,6 +1480,20 @@
       <w:sz w:val="56"/>
       <w:szCs w:val="56"/>
     </w:rPr>
+  </w:style>
+  <w:style w:type="table" w:styleId="TableNormal" w:default="1">
+    <w:name w:val="TableNormal"/>
+    <w:tblPr>
+      <w:tblCellMar>
+        <w:top w:w="100.0" w:type="dxa"/>
+        <w:left w:w="100.0" w:type="dxa"/>
+        <w:bottom w:w="100.0" w:type="dxa"/>
+        <w:right w:w="100.0" w:type="dxa"/>
+      </w:tblCellMar>
+    </w:tblPr>
+  </w:style>
+  <w:style w:type="paragraph" w:styleId="Normal" w:default="1">
+    <w:name w:val="normal"/>
   </w:style>
   <w:style w:type="table" w:styleId="TableNormal" w:default="1">
     <w:name w:val="TableNormal"/>
@@ -2098,7 +2189,7 @@
 
 <file path=customXML/item1.xml><?xml version="1.0" encoding="utf-8"?>
 <go:gDocsCustomXmlDataStorage xmlns:go="http://customooxmlschemas.google.com/" xmlns:r="http://schemas.openxmlformats.org/officeDocument/2006/relationships" uri="GoogleDocsCustomDataVersion2">
-  <go:docsCustomData xmlns:go="http://customooxmlschemas.google.com/" roundtripDataSignature="AMtx7mi9Ija8b3CW0BqtheUoT8CTh9Z3Yw==">CgMxLjAyDmguajhkanAyYzBuanVqMg5oLnFmNzBpcGJibzIwMDIOaC40NWE5bXQ2a29oenYyDmgubngzNzlkdmc5aGF5Mg5oLjN3MzB3ZGx0eTlpbzgAciExODhyRFNyblVnMkZId3oyRjg2eWRfOUlXT0dVd3lZQjM=</go:docsCustomData>
+  <go:docsCustomData xmlns:go="http://customooxmlschemas.google.com/" roundtripDataSignature="AMtx7miP/OQLv3nRaS4MDD5KDYa8wM004g==">CgMxLjAyDmguajhkanAyYzBuanVqMg5oLm54Mzc5ZHZnOWhheTIOaC4zdzMwd2RsdHk5aW84AHIhMUlMZFM1aHdjYXVnVDNXOUJRSTJfQ3hQTnNUMURQMVlN</go:docsCustomData>
 </go:gDocsCustomXmlDataStorage>
 </file>
 

</xml_diff>